<commit_message>
Update WEB lab 11 report
</commit_message>
<xml_diff>
--- a/2KYRS/WEB/Zvits/lab11.docx
+++ b/2KYRS/WEB/Zvits/lab11.docx
@@ -262,13 +262,8 @@
             <w:pPr>
               <w:spacing w:line="360" w:lineRule="auto"/>
             </w:pPr>
-            <w:proofErr w:type="spellStart"/>
             <w:r>
-              <w:t>Рафієв</w:t>
-            </w:r>
-            <w:proofErr w:type="spellEnd"/>
-            <w:r>
-              <w:t xml:space="preserve"> Б. С.</w:t>
+              <w:t>Рафієв Б. С.</w:t>
             </w:r>
           </w:p>
           <w:p>
@@ -436,7 +431,6 @@
           <w:p>
             <w:pPr>
               <w:spacing w:after="0" w:line="360" w:lineRule="auto"/>
-              <w:jc w:val="left"/>
               <w:rPr>
                 <w:rFonts w:eastAsia="Times New Roman" w:cs="Times New Roman"/>
                 <w:b/>
@@ -494,7 +488,6 @@
           <w:p>
             <w:pPr>
               <w:spacing w:after="0" w:line="360" w:lineRule="auto"/>
-              <w:jc w:val="left"/>
               <w:rPr>
                 <w:rFonts w:eastAsia="Times New Roman" w:cs="Times New Roman"/>
                 <w:szCs w:val="28"/>
@@ -537,7 +530,7 @@
     <w:p>
       <w:pPr>
         <w:spacing w:after="0" w:line="360" w:lineRule="auto"/>
-        <w:ind w:firstLine="426"/>
+        <w:ind w:firstLine="851"/>
         <w:jc w:val="both"/>
         <w:rPr>
           <w:rFonts w:eastAsia="Times New Roman" w:cs="Times New Roman"/>
@@ -545,8 +538,6 @@
           <w:lang w:eastAsia="uk-UA"/>
         </w:rPr>
       </w:pPr>
-      <w:proofErr w:type="spellStart"/>
-      <w:proofErr w:type="spellEnd"/>
       <w:r>
         <w:rPr>
           <w:rFonts w:eastAsia="Times New Roman" w:cs="Times New Roman"/>
@@ -554,6 +545,106 @@
           <w:lang w:eastAsia="uk-UA"/>
         </w:rPr>
         <w:t>Відповідно до варіанта 1 створив програму мовою JavaScript, яка демонструє роботу з функціями, об'єктами та масивами.</w:t>
+      </w:r>
+    </w:p>
+    <w:p>
+      <w:pPr>
+        <w:spacing w:after="0" w:line="360" w:lineRule="auto"/>
+        <w:ind w:firstLine="851"/>
+        <w:jc w:val="both"/>
+        <w:rPr>
+          <w:rFonts w:eastAsia="Times New Roman" w:cs="Times New Roman"/>
+          <w:szCs w:val="28"/>
+          <w:lang w:eastAsia="uk-UA"/>
+        </w:rPr>
+      </w:pPr>
+      <w:r>
+        <w:rPr>
+          <w:rFonts w:eastAsia="Times New Roman" w:cs="Times New Roman"/>
+          <w:szCs w:val="28"/>
+          <w:lang w:eastAsia="uk-UA"/>
+        </w:rPr>
+        <w:t>Створив робочу папку Lab11 і файл script.js, який запустив через розширення Code Runner командою node script.js.</w:t>
+      </w:r>
+    </w:p>
+    <w:p>
+      <w:pPr>
+        <w:spacing w:after="0" w:line="360" w:lineRule="auto"/>
+        <w:ind w:firstLine="851"/>
+        <w:jc w:val="both"/>
+        <w:rPr>
+          <w:rFonts w:eastAsia="Times New Roman" w:cs="Times New Roman"/>
+          <w:szCs w:val="28"/>
+          <w:lang w:eastAsia="uk-UA"/>
+        </w:rPr>
+      </w:pPr>
+      <w:r>
+        <w:rPr>
+          <w:rFonts w:eastAsia="Times New Roman" w:cs="Times New Roman"/>
+          <w:szCs w:val="28"/>
+          <w:lang w:eastAsia="uk-UA"/>
+        </w:rPr>
+        <w:t>У завданні 1 оголосив функцію greet, яка приймає ім'я та прізвище як параметри і виводить у консоль вітальне повідомлення у форматі «Привіт, [ім'я] [прізвище]!». Викликав функцію зі своїми даними.</w:t>
+      </w:r>
+    </w:p>
+    <w:p>
+      <w:pPr>
+        <w:spacing w:after="0" w:line="360" w:lineRule="auto"/>
+        <w:ind w:firstLine="851"/>
+        <w:jc w:val="both"/>
+        <w:rPr>
+          <w:rFonts w:eastAsia="Times New Roman" w:cs="Times New Roman"/>
+          <w:szCs w:val="28"/>
+          <w:lang w:eastAsia="uk-UA"/>
+        </w:rPr>
+      </w:pPr>
+      <w:r>
+        <w:rPr>
+          <w:rFonts w:eastAsia="Times New Roman" w:cs="Times New Roman"/>
+          <w:szCs w:val="28"/>
+          <w:lang w:eastAsia="uk-UA"/>
+        </w:rPr>
+        <w:t>У завданні 2 створив об'єкт person з властивостями name, age та email і вивів ім'я людини на консоль. Після створення об'єкта додав ще одну властивість city і також вивів її на консоль.</w:t>
+      </w:r>
+    </w:p>
+    <w:p>
+      <w:pPr>
+        <w:spacing w:after="0" w:line="360" w:lineRule="auto"/>
+        <w:ind w:firstLine="851"/>
+        <w:jc w:val="both"/>
+        <w:rPr>
+          <w:rFonts w:eastAsia="Times New Roman" w:cs="Times New Roman"/>
+          <w:szCs w:val="28"/>
+          <w:lang w:eastAsia="uk-UA"/>
+        </w:rPr>
+      </w:pPr>
+      <w:r>
+        <w:rPr>
+          <w:rFonts w:eastAsia="Times New Roman" w:cs="Times New Roman"/>
+          <w:szCs w:val="28"/>
+          <w:lang w:eastAsia="uk-UA"/>
+        </w:rPr>
+        <w:t>У завданні 3 створив масив чисел numbers і за допомогою циклу for вивів кожне число на консоль.</w:t>
+      </w:r>
+    </w:p>
+    <w:p>
+      <w:pPr>
+        <w:spacing w:after="0" w:line="360" w:lineRule="auto"/>
+        <w:ind w:firstLine="851"/>
+        <w:jc w:val="both"/>
+        <w:rPr>
+          <w:rFonts w:eastAsia="Times New Roman" w:cs="Times New Roman"/>
+          <w:szCs w:val="28"/>
+          <w:lang w:val="en-US" w:eastAsia="uk-UA"/>
+        </w:rPr>
+      </w:pPr>
+      <w:r>
+        <w:rPr>
+          <w:rFonts w:eastAsia="Times New Roman" w:cs="Times New Roman"/>
+          <w:szCs w:val="28"/>
+          <w:lang w:eastAsia="uk-UA"/>
+        </w:rPr>
+        <w:t>Перевірив результат виконання програми в консолі.</w:t>
       </w:r>
     </w:p>
     <w:p>
@@ -564,107 +655,9 @@
         <w:rPr>
           <w:rFonts w:eastAsia="Times New Roman" w:cs="Times New Roman"/>
           <w:szCs w:val="28"/>
-          <w:lang w:eastAsia="uk-UA"/>
-        </w:rPr>
-      </w:pPr>
-      <w:proofErr w:type="spellStart"/>
-      <w:proofErr w:type="spellEnd"/>
-      <w:r>
-        <w:rPr>
-          <w:rFonts w:eastAsia="Times New Roman" w:cs="Times New Roman"/>
-          <w:szCs w:val="28"/>
-          <w:lang w:eastAsia="uk-UA"/>
-        </w:rPr>
-        <w:t>Створив робочу папку Lab11 і файл script.js, який запустив через розширення Code Runner командою node script.js.</w:t>
-      </w:r>
-    </w:p>
-    <w:p>
-      <w:pPr>
-        <w:spacing w:after="0" w:line="360" w:lineRule="auto"/>
-        <w:ind w:firstLine="426"/>
-        <w:jc w:val="both"/>
-        <w:rPr>
-          <w:rFonts w:eastAsia="Times New Roman" w:cs="Times New Roman"/>
-          <w:szCs w:val="28"/>
-          <w:lang w:eastAsia="uk-UA"/>
-        </w:rPr>
-      </w:pPr>
-      <w:proofErr w:type="spellStart"/>
-      <w:proofErr w:type="spellEnd"/>
-      <w:r>
-        <w:rPr>
-          <w:rFonts w:eastAsia="Times New Roman" w:cs="Times New Roman"/>
-          <w:szCs w:val="28"/>
-          <w:lang w:eastAsia="uk-UA"/>
-        </w:rPr>
-        <w:t>У завданні 1 оголосив функцію greet, яка приймає ім'я та прізвище як параметри і виводить у консоль вітальне повідомлення у форматі «Привіт, [ім'я] [прізвище]!». Викликав функцію зі своїми даними.</w:t>
-      </w:r>
-    </w:p>
-    <w:p>
-      <w:pPr>
-        <w:spacing w:after="0" w:line="360" w:lineRule="auto"/>
-        <w:ind w:firstLine="426"/>
-        <w:jc w:val="both"/>
-        <w:rPr>
-          <w:rFonts w:eastAsia="Times New Roman" w:cs="Times New Roman"/>
-          <w:szCs w:val="28"/>
-          <w:lang w:eastAsia="uk-UA"/>
-        </w:rPr>
-      </w:pPr>
-      <w:proofErr w:type="spellStart"/>
-      <w:proofErr w:type="spellEnd"/>
-      <w:r>
-        <w:rPr>
-          <w:rFonts w:eastAsia="Times New Roman" w:cs="Times New Roman"/>
-          <w:szCs w:val="28"/>
-          <w:lang w:eastAsia="uk-UA"/>
-        </w:rPr>
-        <w:t>У завданні 2 створив об'єкт person з властивостями name, age та email і вивів ім'я людини на консоль. Після створення об'єкта додав ще одну властивість city і також вивів її на консоль.</w:t>
-      </w:r>
-    </w:p>
-    <w:p>
-      <w:pPr>
-        <w:spacing w:after="0" w:line="360" w:lineRule="auto"/>
-        <w:ind w:firstLine="426"/>
-        <w:jc w:val="both"/>
-        <w:rPr>
-          <w:rFonts w:eastAsia="Times New Roman" w:cs="Times New Roman"/>
-          <w:szCs w:val="28"/>
-          <w:lang w:eastAsia="uk-UA"/>
-        </w:rPr>
-      </w:pPr>
-      <w:proofErr w:type="spellStart"/>
-      <w:proofErr w:type="spellEnd"/>
-      <w:r>
-        <w:rPr>
-          <w:rFonts w:eastAsia="Times New Roman" w:cs="Times New Roman"/>
-          <w:szCs w:val="28"/>
-          <w:lang w:eastAsia="uk-UA"/>
-        </w:rPr>
-        <w:t>У завданні 3 створив масив чисел numbers і за допомогою циклу for вивів кожне число на консоль.</w:t>
-      </w:r>
-    </w:p>
-    <w:p>
-      <w:pPr>
-        <w:spacing w:after="0" w:line="360" w:lineRule="auto"/>
-        <w:ind w:firstLine="426"/>
-        <w:jc w:val="both"/>
-        <w:rPr>
-          <w:rFonts w:eastAsia="Times New Roman" w:cs="Times New Roman"/>
-          <w:szCs w:val="28"/>
-          <w:lang w:eastAsia="uk-UA"/>
-        </w:rPr>
-      </w:pPr>
-      <w:proofErr w:type="spellStart"/>
-      <w:proofErr w:type="spellEnd"/>
-      <w:r>
-        <w:rPr>
-          <w:rFonts w:eastAsia="Times New Roman" w:cs="Times New Roman"/>
-          <w:szCs w:val="28"/>
-          <w:lang w:eastAsia="uk-UA"/>
-        </w:rPr>
-        <w:t>Перевірив результат виконання програми в консолі.</w:t>
-      </w:r>
+          <w:lang w:val="en-US" w:eastAsia="uk-UA"/>
+        </w:rPr>
+      </w:pPr>
     </w:p>
     <w:p>
       <w:pPr>
@@ -674,22 +667,26 @@
         <w:jc w:val="center"/>
       </w:pPr>
       <w:r>
+        <w:rPr>
+          <w:noProof/>
+        </w:rPr>
         <w:drawing>
-          <wp:inline xmlns:a="http://schemas.openxmlformats.org/drawingml/2006/main" xmlns:pic="http://schemas.openxmlformats.org/drawingml/2006/picture">
+          <wp:inline distT="0" distB="0" distL="0" distR="0" wp14:anchorId="0FD59562" wp14:editId="0FD0867A">
             <wp:extent cx="5990000" cy="2670814"/>
+            <wp:effectExtent l="0" t="0" r="0" b="0"/>
             <wp:docPr id="1" name="Picture 1"/>
             <wp:cNvGraphicFramePr>
-              <a:graphicFrameLocks noChangeAspect="1"/>
+              <a:graphicFrameLocks xmlns:a="http://schemas.openxmlformats.org/drawingml/2006/main" noChangeAspect="1"/>
             </wp:cNvGraphicFramePr>
-            <a:graphic>
+            <a:graphic xmlns:a="http://schemas.openxmlformats.org/drawingml/2006/main">
               <a:graphicData uri="http://schemas.openxmlformats.org/drawingml/2006/picture">
-                <pic:pic>
+                <pic:pic xmlns:pic="http://schemas.openxmlformats.org/drawingml/2006/picture">
                   <pic:nvPicPr>
                     <pic:cNvPr id="0" name="console.png"/>
                     <pic:cNvPicPr/>
                   </pic:nvPicPr>
                   <pic:blipFill>
-                    <a:blip r:embed="rId9"/>
+                    <a:blip r:embed="rId6"/>
                     <a:stretch>
                       <a:fillRect/>
                     </a:stretch>
@@ -699,7 +696,9 @@
                       <a:off x="0" y="0"/>
                       <a:ext cx="5990000" cy="2670814"/>
                     </a:xfrm>
-                    <a:prstGeom prst="rect"/>
+                    <a:prstGeom prst="rect">
+                      <a:avLst/>
+                    </a:prstGeom>
                   </pic:spPr>
                 </pic:pic>
               </a:graphicData>
@@ -726,922 +725,9 @@
         <w:rPr>
           <w:rFonts w:eastAsia="Times New Roman" w:cs="Times New Roman"/>
           <w:szCs w:val="28"/>
-          <w:lang w:eastAsia="uk-UA"/>
-        </w:rPr>
-      </w:pPr>
-      <w:proofErr w:type="spellStart"/>
-      <w:proofErr w:type="spellEnd"/>
-      <w:r>
-        <w:rPr>
-          <w:rFonts w:eastAsia="Times New Roman" w:cs="Times New Roman"/>
-          <w:szCs w:val="28"/>
-          <w:lang w:eastAsia="uk-UA"/>
-        </w:rPr>
-        <w:t>Код програми script.js:</w:t>
-      </w:r>
-    </w:p>
-    <w:p>
-      <w:pPr>
-        <w:spacing w:after="0" w:line="228" w:lineRule="auto" w:before="0"/>
-        <w:rPr>
-          <w:rFonts w:ascii="Courier New" w:eastAsia="Times New Roman" w:hAnsi="Courier New" w:cs="Courier New"/>
-          <w:szCs w:val="28"/>
-          <w:lang w:eastAsia="uk-UA"/>
-        </w:rPr>
-      </w:pPr>
-      <w:proofErr w:type="spellStart"/>
-      <w:proofErr w:type="spellEnd"/>
-      <w:r>
-        <w:rPr>
-          <w:rFonts w:ascii="Courier New" w:eastAsia="Times New Roman" w:hAnsi="Courier New" w:cs="Courier New"/>
-          <w:sz w:val="20"/>
-          <w:szCs w:val="28"/>
-          <w:lang w:eastAsia="uk-UA"/>
-        </w:rPr>
-        <w:t>// ============================================================</w:t>
-      </w:r>
-    </w:p>
-    <w:p>
-      <w:pPr>
-        <w:spacing w:after="0" w:line="228" w:lineRule="auto" w:before="0"/>
-        <w:rPr>
-          <w:rFonts w:ascii="Courier New" w:eastAsia="Times New Roman" w:hAnsi="Courier New" w:cs="Courier New"/>
-          <w:szCs w:val="28"/>
-          <w:lang w:eastAsia="uk-UA"/>
-        </w:rPr>
-      </w:pPr>
-      <w:proofErr w:type="spellStart"/>
-      <w:proofErr w:type="spellEnd"/>
-      <w:r>
-        <w:rPr>
-          <w:rFonts w:ascii="Courier New" w:eastAsia="Times New Roman" w:hAnsi="Courier New" w:cs="Courier New"/>
-          <w:sz w:val="20"/>
-          <w:szCs w:val="28"/>
-          <w:lang w:eastAsia="uk-UA"/>
-        </w:rPr>
-        <w:t>// Лабораторна робота №11. Варіант 1</w:t>
-      </w:r>
-    </w:p>
-    <w:p>
-      <w:pPr>
-        <w:spacing w:after="0" w:line="228" w:lineRule="auto" w:before="0"/>
-        <w:rPr>
-          <w:rFonts w:ascii="Courier New" w:eastAsia="Times New Roman" w:hAnsi="Courier New" w:cs="Courier New"/>
-          <w:szCs w:val="28"/>
-          <w:lang w:eastAsia="uk-UA"/>
-        </w:rPr>
-      </w:pPr>
-      <w:proofErr w:type="spellStart"/>
-      <w:proofErr w:type="spellEnd"/>
-      <w:r>
-        <w:rPr>
-          <w:rFonts w:ascii="Courier New" w:eastAsia="Times New Roman" w:hAnsi="Courier New" w:cs="Courier New"/>
-          <w:sz w:val="20"/>
-          <w:szCs w:val="28"/>
-          <w:lang w:eastAsia="uk-UA"/>
-        </w:rPr>
-        <w:t>// Тема: масиви, об'єкти та функції у JavaScript</w:t>
-      </w:r>
-    </w:p>
-    <w:p>
-      <w:pPr>
-        <w:spacing w:after="0" w:line="228" w:lineRule="auto" w:before="0"/>
-        <w:rPr>
-          <w:rFonts w:ascii="Courier New" w:eastAsia="Times New Roman" w:hAnsi="Courier New" w:cs="Courier New"/>
-          <w:szCs w:val="28"/>
-          <w:lang w:eastAsia="uk-UA"/>
-        </w:rPr>
-      </w:pPr>
-      <w:proofErr w:type="spellStart"/>
-      <w:proofErr w:type="spellEnd"/>
-      <w:r>
-        <w:rPr>
-          <w:rFonts w:ascii="Courier New" w:eastAsia="Times New Roman" w:hAnsi="Courier New" w:cs="Courier New"/>
-          <w:sz w:val="20"/>
-          <w:szCs w:val="28"/>
-          <w:lang w:eastAsia="uk-UA"/>
-        </w:rPr>
-        <w:t>//</w:t>
-      </w:r>
-    </w:p>
-    <w:p>
-      <w:pPr>
-        <w:spacing w:after="0" w:line="228" w:lineRule="auto" w:before="0"/>
-        <w:rPr>
-          <w:rFonts w:ascii="Courier New" w:eastAsia="Times New Roman" w:hAnsi="Courier New" w:cs="Courier New"/>
-          <w:szCs w:val="28"/>
-          <w:lang w:eastAsia="uk-UA"/>
-        </w:rPr>
-      </w:pPr>
-      <w:proofErr w:type="spellStart"/>
-      <w:proofErr w:type="spellEnd"/>
-      <w:r>
-        <w:rPr>
-          <w:rFonts w:ascii="Courier New" w:eastAsia="Times New Roman" w:hAnsi="Courier New" w:cs="Courier New"/>
-          <w:sz w:val="20"/>
-          <w:szCs w:val="28"/>
-          <w:lang w:eastAsia="uk-UA"/>
-        </w:rPr>
-        <w:t>// Завдання 1: функція greet, що приймає ім'я та прізвище</w:t>
-      </w:r>
-    </w:p>
-    <w:p>
-      <w:pPr>
-        <w:spacing w:after="0" w:line="228" w:lineRule="auto" w:before="0"/>
-        <w:rPr>
-          <w:rFonts w:ascii="Courier New" w:eastAsia="Times New Roman" w:hAnsi="Courier New" w:cs="Courier New"/>
-          <w:szCs w:val="28"/>
-          <w:lang w:eastAsia="uk-UA"/>
-        </w:rPr>
-      </w:pPr>
-      <w:proofErr w:type="spellStart"/>
-      <w:proofErr w:type="spellEnd"/>
-      <w:r>
-        <w:rPr>
-          <w:rFonts w:ascii="Courier New" w:eastAsia="Times New Roman" w:hAnsi="Courier New" w:cs="Courier New"/>
-          <w:sz w:val="20"/>
-          <w:szCs w:val="28"/>
-          <w:lang w:eastAsia="uk-UA"/>
-        </w:rPr>
-        <w:t>//             і виводить вітальне повідомлення в консоль.</w:t>
-      </w:r>
-    </w:p>
-    <w:p>
-      <w:pPr>
-        <w:spacing w:after="0" w:line="228" w:lineRule="auto" w:before="0"/>
-        <w:rPr>
-          <w:rFonts w:ascii="Courier New" w:eastAsia="Times New Roman" w:hAnsi="Courier New" w:cs="Courier New"/>
-          <w:szCs w:val="28"/>
-          <w:lang w:eastAsia="uk-UA"/>
-        </w:rPr>
-      </w:pPr>
-      <w:proofErr w:type="spellStart"/>
-      <w:proofErr w:type="spellEnd"/>
-      <w:r>
-        <w:rPr>
-          <w:rFonts w:ascii="Courier New" w:eastAsia="Times New Roman" w:hAnsi="Courier New" w:cs="Courier New"/>
-          <w:sz w:val="20"/>
-          <w:szCs w:val="28"/>
-          <w:lang w:eastAsia="uk-UA"/>
-        </w:rPr>
-        <w:t>// Завдання 2: об'єкт person з іменем, віком та електронною</w:t>
-      </w:r>
-    </w:p>
-    <w:p>
-      <w:pPr>
-        <w:spacing w:after="0" w:line="228" w:lineRule="auto" w:before="0"/>
-        <w:rPr>
-          <w:rFonts w:ascii="Courier New" w:eastAsia="Times New Roman" w:hAnsi="Courier New" w:cs="Courier New"/>
-          <w:szCs w:val="28"/>
-          <w:lang w:eastAsia="uk-UA"/>
-        </w:rPr>
-      </w:pPr>
-      <w:proofErr w:type="spellStart"/>
-      <w:proofErr w:type="spellEnd"/>
-      <w:r>
-        <w:rPr>
-          <w:rFonts w:ascii="Courier New" w:eastAsia="Times New Roman" w:hAnsi="Courier New" w:cs="Courier New"/>
-          <w:sz w:val="20"/>
-          <w:szCs w:val="28"/>
-          <w:lang w:eastAsia="uk-UA"/>
-        </w:rPr>
-        <w:t>//             адресою; додати нову властивість і вивести її.</w:t>
-      </w:r>
-    </w:p>
-    <w:p>
-      <w:pPr>
-        <w:spacing w:after="0" w:line="228" w:lineRule="auto" w:before="0"/>
-        <w:rPr>
-          <w:rFonts w:ascii="Courier New" w:eastAsia="Times New Roman" w:hAnsi="Courier New" w:cs="Courier New"/>
-          <w:szCs w:val="28"/>
-          <w:lang w:eastAsia="uk-UA"/>
-        </w:rPr>
-      </w:pPr>
-      <w:proofErr w:type="spellStart"/>
-      <w:proofErr w:type="spellEnd"/>
-      <w:r>
-        <w:rPr>
-          <w:rFonts w:ascii="Courier New" w:eastAsia="Times New Roman" w:hAnsi="Courier New" w:cs="Courier New"/>
-          <w:sz w:val="20"/>
-          <w:szCs w:val="28"/>
-          <w:lang w:eastAsia="uk-UA"/>
-        </w:rPr>
-        <w:t>// Завдання 3: масив чисел і виведення його циклом for.</w:t>
-      </w:r>
-    </w:p>
-    <w:p>
-      <w:pPr>
-        <w:spacing w:after="0" w:line="228" w:lineRule="auto" w:before="0"/>
-        <w:rPr>
-          <w:rFonts w:ascii="Courier New" w:eastAsia="Times New Roman" w:hAnsi="Courier New" w:cs="Courier New"/>
-          <w:szCs w:val="28"/>
-          <w:lang w:eastAsia="uk-UA"/>
-        </w:rPr>
-      </w:pPr>
-      <w:proofErr w:type="spellStart"/>
-      <w:proofErr w:type="spellEnd"/>
-      <w:r>
-        <w:rPr>
-          <w:rFonts w:ascii="Courier New" w:eastAsia="Times New Roman" w:hAnsi="Courier New" w:cs="Courier New"/>
-          <w:sz w:val="20"/>
-          <w:szCs w:val="28"/>
-          <w:lang w:eastAsia="uk-UA"/>
-        </w:rPr>
-        <w:t>// ============================================================</w:t>
-      </w:r>
-    </w:p>
-    <w:p>
-      <w:pPr>
-        <w:spacing w:after="0" w:line="228" w:lineRule="auto" w:before="0"/>
-        <w:rPr>
-          <w:rFonts w:ascii="Courier New" w:eastAsia="Times New Roman" w:hAnsi="Courier New" w:cs="Courier New"/>
-          <w:szCs w:val="28"/>
-          <w:lang w:eastAsia="uk-UA"/>
-        </w:rPr>
-      </w:pPr>
-      <w:proofErr w:type="spellStart"/>
-      <w:proofErr w:type="spellEnd"/>
-      <w:r>
-        <w:rPr>
-          <w:rFonts w:ascii="Courier New" w:eastAsia="Times New Roman" w:hAnsi="Courier New" w:cs="Courier New"/>
-          <w:sz w:val="20"/>
-          <w:szCs w:val="28"/>
-          <w:lang w:eastAsia="uk-UA"/>
-        </w:rPr>
-        <w:t xml:space="preserve"> </w:t>
-      </w:r>
-    </w:p>
-    <w:p>
-      <w:pPr>
-        <w:spacing w:after="0" w:line="228" w:lineRule="auto" w:before="0"/>
-        <w:rPr>
-          <w:rFonts w:ascii="Courier New" w:eastAsia="Times New Roman" w:hAnsi="Courier New" w:cs="Courier New"/>
-          <w:szCs w:val="28"/>
-          <w:lang w:eastAsia="uk-UA"/>
-        </w:rPr>
-      </w:pPr>
-      <w:proofErr w:type="spellStart"/>
-      <w:proofErr w:type="spellEnd"/>
-      <w:r>
-        <w:rPr>
-          <w:rFonts w:ascii="Courier New" w:eastAsia="Times New Roman" w:hAnsi="Courier New" w:cs="Courier New"/>
-          <w:sz w:val="20"/>
-          <w:szCs w:val="28"/>
-          <w:lang w:eastAsia="uk-UA"/>
-        </w:rPr>
-        <w:t>// 1. Функція вітання</w:t>
-      </w:r>
-    </w:p>
-    <w:p>
-      <w:pPr>
-        <w:spacing w:after="0" w:line="228" w:lineRule="auto" w:before="0"/>
-        <w:rPr>
-          <w:rFonts w:ascii="Courier New" w:eastAsia="Times New Roman" w:hAnsi="Courier New" w:cs="Courier New"/>
-          <w:szCs w:val="28"/>
-          <w:lang w:eastAsia="uk-UA"/>
-        </w:rPr>
-      </w:pPr>
-      <w:proofErr w:type="spellStart"/>
-      <w:proofErr w:type="spellEnd"/>
-      <w:r>
-        <w:rPr>
-          <w:rFonts w:ascii="Courier New" w:eastAsia="Times New Roman" w:hAnsi="Courier New" w:cs="Courier New"/>
-          <w:sz w:val="20"/>
-          <w:szCs w:val="28"/>
-          <w:lang w:eastAsia="uk-UA"/>
-        </w:rPr>
-        <w:t>console.log("Завдання 1:");</w:t>
-      </w:r>
-    </w:p>
-    <w:p>
-      <w:pPr>
-        <w:spacing w:after="0" w:line="228" w:lineRule="auto" w:before="0"/>
-        <w:rPr>
-          <w:rFonts w:ascii="Courier New" w:eastAsia="Times New Roman" w:hAnsi="Courier New" w:cs="Courier New"/>
-          <w:szCs w:val="28"/>
-          <w:lang w:eastAsia="uk-UA"/>
-        </w:rPr>
-      </w:pPr>
-      <w:proofErr w:type="spellStart"/>
-      <w:proofErr w:type="spellEnd"/>
-      <w:r>
-        <w:rPr>
-          <w:rFonts w:ascii="Courier New" w:eastAsia="Times New Roman" w:hAnsi="Courier New" w:cs="Courier New"/>
-          <w:sz w:val="20"/>
-          <w:szCs w:val="28"/>
-          <w:lang w:eastAsia="uk-UA"/>
-        </w:rPr>
-        <w:t xml:space="preserve"> </w:t>
-      </w:r>
-    </w:p>
-    <w:p>
-      <w:pPr>
-        <w:spacing w:after="0" w:line="228" w:lineRule="auto" w:before="0"/>
-        <w:rPr>
-          <w:rFonts w:ascii="Courier New" w:eastAsia="Times New Roman" w:hAnsi="Courier New" w:cs="Courier New"/>
-          <w:szCs w:val="28"/>
-          <w:lang w:eastAsia="uk-UA"/>
-        </w:rPr>
-      </w:pPr>
-      <w:proofErr w:type="spellStart"/>
-      <w:proofErr w:type="spellEnd"/>
-      <w:r>
-        <w:rPr>
-          <w:rFonts w:ascii="Courier New" w:eastAsia="Times New Roman" w:hAnsi="Courier New" w:cs="Courier New"/>
-          <w:sz w:val="20"/>
-          <w:szCs w:val="28"/>
-          <w:lang w:eastAsia="uk-UA"/>
-        </w:rPr>
-        <w:t>function greet(firstName, lastName) {</w:t>
-      </w:r>
-    </w:p>
-    <w:p>
-      <w:pPr>
-        <w:spacing w:after="0" w:line="228" w:lineRule="auto" w:before="0"/>
-        <w:rPr>
-          <w:rFonts w:ascii="Courier New" w:eastAsia="Times New Roman" w:hAnsi="Courier New" w:cs="Courier New"/>
-          <w:szCs w:val="28"/>
-          <w:lang w:eastAsia="uk-UA"/>
-        </w:rPr>
-      </w:pPr>
-      <w:proofErr w:type="spellStart"/>
-      <w:proofErr w:type="spellEnd"/>
-      <w:r>
-        <w:rPr>
-          <w:rFonts w:ascii="Courier New" w:eastAsia="Times New Roman" w:hAnsi="Courier New" w:cs="Courier New"/>
-          <w:sz w:val="20"/>
-          <w:szCs w:val="28"/>
-          <w:lang w:eastAsia="uk-UA"/>
-        </w:rPr>
-        <w:t xml:space="preserve">    console.log("Привіт, " + firstName + " " + lastName + "!");</w:t>
-      </w:r>
-    </w:p>
-    <w:p>
-      <w:pPr>
-        <w:spacing w:after="0" w:line="228" w:lineRule="auto" w:before="0"/>
-        <w:rPr>
-          <w:rFonts w:ascii="Courier New" w:eastAsia="Times New Roman" w:hAnsi="Courier New" w:cs="Courier New"/>
-          <w:szCs w:val="28"/>
-          <w:lang w:eastAsia="uk-UA"/>
-        </w:rPr>
-      </w:pPr>
-      <w:proofErr w:type="spellStart"/>
-      <w:proofErr w:type="spellEnd"/>
-      <w:r>
-        <w:rPr>
-          <w:rFonts w:ascii="Courier New" w:eastAsia="Times New Roman" w:hAnsi="Courier New" w:cs="Courier New"/>
-          <w:sz w:val="20"/>
-          <w:szCs w:val="28"/>
-          <w:lang w:eastAsia="uk-UA"/>
-        </w:rPr>
-        <w:t>}</w:t>
-      </w:r>
-    </w:p>
-    <w:p>
-      <w:pPr>
-        <w:spacing w:after="0" w:line="228" w:lineRule="auto" w:before="0"/>
-        <w:rPr>
-          <w:rFonts w:ascii="Courier New" w:eastAsia="Times New Roman" w:hAnsi="Courier New" w:cs="Courier New"/>
-          <w:szCs w:val="28"/>
-          <w:lang w:eastAsia="uk-UA"/>
-        </w:rPr>
-      </w:pPr>
-      <w:proofErr w:type="spellStart"/>
-      <w:proofErr w:type="spellEnd"/>
-      <w:r>
-        <w:rPr>
-          <w:rFonts w:ascii="Courier New" w:eastAsia="Times New Roman" w:hAnsi="Courier New" w:cs="Courier New"/>
-          <w:sz w:val="20"/>
-          <w:szCs w:val="28"/>
-          <w:lang w:eastAsia="uk-UA"/>
-        </w:rPr>
-        <w:t xml:space="preserve"> </w:t>
-      </w:r>
-    </w:p>
-    <w:p>
-      <w:pPr>
-        <w:spacing w:after="0" w:line="228" w:lineRule="auto" w:before="0"/>
-        <w:rPr>
-          <w:rFonts w:ascii="Courier New" w:eastAsia="Times New Roman" w:hAnsi="Courier New" w:cs="Courier New"/>
-          <w:szCs w:val="28"/>
-          <w:lang w:eastAsia="uk-UA"/>
-        </w:rPr>
-      </w:pPr>
-      <w:proofErr w:type="spellStart"/>
-      <w:proofErr w:type="spellEnd"/>
-      <w:r>
-        <w:rPr>
-          <w:rFonts w:ascii="Courier New" w:eastAsia="Times New Roman" w:hAnsi="Courier New" w:cs="Courier New"/>
-          <w:sz w:val="20"/>
-          <w:szCs w:val="28"/>
-          <w:lang w:eastAsia="uk-UA"/>
-        </w:rPr>
-        <w:t>greet("Богдан", "Рафієв");</w:t>
-      </w:r>
-    </w:p>
-    <w:p>
-      <w:pPr>
-        <w:spacing w:after="0" w:line="228" w:lineRule="auto" w:before="0"/>
-        <w:rPr>
-          <w:rFonts w:ascii="Courier New" w:eastAsia="Times New Roman" w:hAnsi="Courier New" w:cs="Courier New"/>
-          <w:szCs w:val="28"/>
-          <w:lang w:eastAsia="uk-UA"/>
-        </w:rPr>
-      </w:pPr>
-      <w:proofErr w:type="spellStart"/>
-      <w:proofErr w:type="spellEnd"/>
-      <w:r>
-        <w:rPr>
-          <w:rFonts w:ascii="Courier New" w:eastAsia="Times New Roman" w:hAnsi="Courier New" w:cs="Courier New"/>
-          <w:sz w:val="20"/>
-          <w:szCs w:val="28"/>
-          <w:lang w:eastAsia="uk-UA"/>
-        </w:rPr>
-        <w:t xml:space="preserve"> </w:t>
-      </w:r>
-    </w:p>
-    <w:p>
-      <w:pPr>
-        <w:spacing w:after="0" w:line="228" w:lineRule="auto" w:before="0"/>
-        <w:rPr>
-          <w:rFonts w:ascii="Courier New" w:eastAsia="Times New Roman" w:hAnsi="Courier New" w:cs="Courier New"/>
-          <w:szCs w:val="28"/>
-          <w:lang w:eastAsia="uk-UA"/>
-        </w:rPr>
-      </w:pPr>
-      <w:proofErr w:type="spellStart"/>
-      <w:proofErr w:type="spellEnd"/>
-      <w:r>
-        <w:rPr>
-          <w:rFonts w:ascii="Courier New" w:eastAsia="Times New Roman" w:hAnsi="Courier New" w:cs="Courier New"/>
-          <w:sz w:val="20"/>
-          <w:szCs w:val="28"/>
-          <w:lang w:eastAsia="uk-UA"/>
-        </w:rPr>
-        <w:t>// 2. Об'єкт, що представляє людину</w:t>
-      </w:r>
-    </w:p>
-    <w:p>
-      <w:pPr>
-        <w:spacing w:after="0" w:line="228" w:lineRule="auto" w:before="0"/>
-        <w:rPr>
-          <w:rFonts w:ascii="Courier New" w:eastAsia="Times New Roman" w:hAnsi="Courier New" w:cs="Courier New"/>
-          <w:szCs w:val="28"/>
-          <w:lang w:eastAsia="uk-UA"/>
-        </w:rPr>
-      </w:pPr>
-      <w:proofErr w:type="spellStart"/>
-      <w:proofErr w:type="spellEnd"/>
-      <w:r>
-        <w:rPr>
-          <w:rFonts w:ascii="Courier New" w:eastAsia="Times New Roman" w:hAnsi="Courier New" w:cs="Courier New"/>
-          <w:sz w:val="20"/>
-          <w:szCs w:val="28"/>
-          <w:lang w:eastAsia="uk-UA"/>
-        </w:rPr>
-        <w:t>console.log("Завдання 2:");</w:t>
-      </w:r>
-    </w:p>
-    <w:p>
-      <w:pPr>
-        <w:spacing w:after="0" w:line="228" w:lineRule="auto" w:before="0"/>
-        <w:rPr>
-          <w:rFonts w:ascii="Courier New" w:eastAsia="Times New Roman" w:hAnsi="Courier New" w:cs="Courier New"/>
-          <w:szCs w:val="28"/>
-          <w:lang w:eastAsia="uk-UA"/>
-        </w:rPr>
-      </w:pPr>
-      <w:proofErr w:type="spellStart"/>
-      <w:proofErr w:type="spellEnd"/>
-      <w:r>
-        <w:rPr>
-          <w:rFonts w:ascii="Courier New" w:eastAsia="Times New Roman" w:hAnsi="Courier New" w:cs="Courier New"/>
-          <w:sz w:val="20"/>
-          <w:szCs w:val="28"/>
-          <w:lang w:eastAsia="uk-UA"/>
-        </w:rPr>
-        <w:t xml:space="preserve"> </w:t>
-      </w:r>
-    </w:p>
-    <w:p>
-      <w:pPr>
-        <w:spacing w:after="0" w:line="228" w:lineRule="auto" w:before="0"/>
-        <w:rPr>
-          <w:rFonts w:ascii="Courier New" w:eastAsia="Times New Roman" w:hAnsi="Courier New" w:cs="Courier New"/>
-          <w:szCs w:val="28"/>
-          <w:lang w:eastAsia="uk-UA"/>
-        </w:rPr>
-      </w:pPr>
-      <w:proofErr w:type="spellStart"/>
-      <w:proofErr w:type="spellEnd"/>
-      <w:r>
-        <w:rPr>
-          <w:rFonts w:ascii="Courier New" w:eastAsia="Times New Roman" w:hAnsi="Courier New" w:cs="Courier New"/>
-          <w:sz w:val="20"/>
-          <w:szCs w:val="28"/>
-          <w:lang w:eastAsia="uk-UA"/>
-        </w:rPr>
-        <w:t>var person = {</w:t>
-      </w:r>
-    </w:p>
-    <w:p>
-      <w:pPr>
-        <w:spacing w:after="0" w:line="228" w:lineRule="auto" w:before="0"/>
-        <w:rPr>
-          <w:rFonts w:ascii="Courier New" w:eastAsia="Times New Roman" w:hAnsi="Courier New" w:cs="Courier New"/>
-          <w:szCs w:val="28"/>
-          <w:lang w:eastAsia="uk-UA"/>
-        </w:rPr>
-      </w:pPr>
-      <w:proofErr w:type="spellStart"/>
-      <w:proofErr w:type="spellEnd"/>
-      <w:r>
-        <w:rPr>
-          <w:rFonts w:ascii="Courier New" w:eastAsia="Times New Roman" w:hAnsi="Courier New" w:cs="Courier New"/>
-          <w:sz w:val="20"/>
-          <w:szCs w:val="28"/>
-          <w:lang w:eastAsia="uk-UA"/>
-        </w:rPr>
-        <w:t xml:space="preserve">    name: "Богдан",</w:t>
-      </w:r>
-    </w:p>
-    <w:p>
-      <w:pPr>
-        <w:spacing w:after="0" w:line="228" w:lineRule="auto" w:before="0"/>
-        <w:rPr>
-          <w:rFonts w:ascii="Courier New" w:eastAsia="Times New Roman" w:hAnsi="Courier New" w:cs="Courier New"/>
-          <w:szCs w:val="28"/>
-          <w:lang w:eastAsia="uk-UA"/>
-        </w:rPr>
-      </w:pPr>
-      <w:proofErr w:type="spellStart"/>
-      <w:proofErr w:type="spellEnd"/>
-      <w:r>
-        <w:rPr>
-          <w:rFonts w:ascii="Courier New" w:eastAsia="Times New Roman" w:hAnsi="Courier New" w:cs="Courier New"/>
-          <w:sz w:val="20"/>
-          <w:szCs w:val="28"/>
-          <w:lang w:eastAsia="uk-UA"/>
-        </w:rPr>
-        <w:t xml:space="preserve">    age: 20,</w:t>
-      </w:r>
-    </w:p>
-    <w:p>
-      <w:pPr>
-        <w:spacing w:after="0" w:line="228" w:lineRule="auto" w:before="0"/>
-        <w:rPr>
-          <w:rFonts w:ascii="Courier New" w:eastAsia="Times New Roman" w:hAnsi="Courier New" w:cs="Courier New"/>
-          <w:szCs w:val="28"/>
-          <w:lang w:eastAsia="uk-UA"/>
-        </w:rPr>
-      </w:pPr>
-      <w:proofErr w:type="spellStart"/>
-      <w:proofErr w:type="spellEnd"/>
-      <w:r>
-        <w:rPr>
-          <w:rFonts w:ascii="Courier New" w:eastAsia="Times New Roman" w:hAnsi="Courier New" w:cs="Courier New"/>
-          <w:sz w:val="20"/>
-          <w:szCs w:val="28"/>
-          <w:lang w:eastAsia="uk-UA"/>
-        </w:rPr>
-        <w:t xml:space="preserve">    email: "bohdan.rafiev@example.com"</w:t>
-      </w:r>
-    </w:p>
-    <w:p>
-      <w:pPr>
-        <w:spacing w:after="0" w:line="228" w:lineRule="auto" w:before="0"/>
-        <w:rPr>
-          <w:rFonts w:ascii="Courier New" w:eastAsia="Times New Roman" w:hAnsi="Courier New" w:cs="Courier New"/>
-          <w:szCs w:val="28"/>
-          <w:lang w:eastAsia="uk-UA"/>
-        </w:rPr>
-      </w:pPr>
-      <w:proofErr w:type="spellStart"/>
-      <w:proofErr w:type="spellEnd"/>
-      <w:r>
-        <w:rPr>
-          <w:rFonts w:ascii="Courier New" w:eastAsia="Times New Roman" w:hAnsi="Courier New" w:cs="Courier New"/>
-          <w:sz w:val="20"/>
-          <w:szCs w:val="28"/>
-          <w:lang w:eastAsia="uk-UA"/>
-        </w:rPr>
-        <w:t>};</w:t>
-      </w:r>
-    </w:p>
-    <w:p>
-      <w:pPr>
-        <w:spacing w:after="0" w:line="228" w:lineRule="auto" w:before="0"/>
-        <w:rPr>
-          <w:rFonts w:ascii="Courier New" w:eastAsia="Times New Roman" w:hAnsi="Courier New" w:cs="Courier New"/>
-          <w:szCs w:val="28"/>
-          <w:lang w:eastAsia="uk-UA"/>
-        </w:rPr>
-      </w:pPr>
-      <w:proofErr w:type="spellStart"/>
-      <w:proofErr w:type="spellEnd"/>
-      <w:r>
-        <w:rPr>
-          <w:rFonts w:ascii="Courier New" w:eastAsia="Times New Roman" w:hAnsi="Courier New" w:cs="Courier New"/>
-          <w:sz w:val="20"/>
-          <w:szCs w:val="28"/>
-          <w:lang w:eastAsia="uk-UA"/>
-        </w:rPr>
-        <w:t xml:space="preserve"> </w:t>
-      </w:r>
-    </w:p>
-    <w:p>
-      <w:pPr>
-        <w:spacing w:after="0" w:line="228" w:lineRule="auto" w:before="0"/>
-        <w:rPr>
-          <w:rFonts w:ascii="Courier New" w:eastAsia="Times New Roman" w:hAnsi="Courier New" w:cs="Courier New"/>
-          <w:szCs w:val="28"/>
-          <w:lang w:eastAsia="uk-UA"/>
-        </w:rPr>
-      </w:pPr>
-      <w:proofErr w:type="spellStart"/>
-      <w:proofErr w:type="spellEnd"/>
-      <w:r>
-        <w:rPr>
-          <w:rFonts w:ascii="Courier New" w:eastAsia="Times New Roman" w:hAnsi="Courier New" w:cs="Courier New"/>
-          <w:sz w:val="20"/>
-          <w:szCs w:val="28"/>
-          <w:lang w:eastAsia="uk-UA"/>
-        </w:rPr>
-        <w:t>console.log("Ім'я:", person.name);</w:t>
-      </w:r>
-    </w:p>
-    <w:p>
-      <w:pPr>
-        <w:spacing w:after="0" w:line="228" w:lineRule="auto" w:before="0"/>
-        <w:rPr>
-          <w:rFonts w:ascii="Courier New" w:eastAsia="Times New Roman" w:hAnsi="Courier New" w:cs="Courier New"/>
-          <w:szCs w:val="28"/>
-          <w:lang w:eastAsia="uk-UA"/>
-        </w:rPr>
-      </w:pPr>
-      <w:proofErr w:type="spellStart"/>
-      <w:proofErr w:type="spellEnd"/>
-      <w:r>
-        <w:rPr>
-          <w:rFonts w:ascii="Courier New" w:eastAsia="Times New Roman" w:hAnsi="Courier New" w:cs="Courier New"/>
-          <w:sz w:val="20"/>
-          <w:szCs w:val="28"/>
-          <w:lang w:eastAsia="uk-UA"/>
-        </w:rPr>
-        <w:t xml:space="preserve"> </w:t>
-      </w:r>
-    </w:p>
-    <w:p>
-      <w:pPr>
-        <w:spacing w:after="0" w:line="228" w:lineRule="auto" w:before="0"/>
-        <w:rPr>
-          <w:rFonts w:ascii="Courier New" w:eastAsia="Times New Roman" w:hAnsi="Courier New" w:cs="Courier New"/>
-          <w:szCs w:val="28"/>
-          <w:lang w:eastAsia="uk-UA"/>
-        </w:rPr>
-      </w:pPr>
-      <w:proofErr w:type="spellStart"/>
-      <w:proofErr w:type="spellEnd"/>
-      <w:r>
-        <w:rPr>
-          <w:rFonts w:ascii="Courier New" w:eastAsia="Times New Roman" w:hAnsi="Courier New" w:cs="Courier New"/>
-          <w:sz w:val="20"/>
-          <w:szCs w:val="28"/>
-          <w:lang w:eastAsia="uk-UA"/>
-        </w:rPr>
-        <w:t>// Додаємо нову властивість після створення об'єкта</w:t>
-      </w:r>
-    </w:p>
-    <w:p>
-      <w:pPr>
-        <w:spacing w:after="0" w:line="228" w:lineRule="auto" w:before="0"/>
-        <w:rPr>
-          <w:rFonts w:ascii="Courier New" w:eastAsia="Times New Roman" w:hAnsi="Courier New" w:cs="Courier New"/>
-          <w:szCs w:val="28"/>
-          <w:lang w:eastAsia="uk-UA"/>
-        </w:rPr>
-      </w:pPr>
-      <w:proofErr w:type="spellStart"/>
-      <w:proofErr w:type="spellEnd"/>
-      <w:r>
-        <w:rPr>
-          <w:rFonts w:ascii="Courier New" w:eastAsia="Times New Roman" w:hAnsi="Courier New" w:cs="Courier New"/>
-          <w:sz w:val="20"/>
-          <w:szCs w:val="28"/>
-          <w:lang w:eastAsia="uk-UA"/>
-        </w:rPr>
-        <w:t>person.city = "Кременчук";</w:t>
-      </w:r>
-    </w:p>
-    <w:p>
-      <w:pPr>
-        <w:spacing w:after="0" w:line="228" w:lineRule="auto" w:before="0"/>
-        <w:rPr>
-          <w:rFonts w:ascii="Courier New" w:eastAsia="Times New Roman" w:hAnsi="Courier New" w:cs="Courier New"/>
-          <w:szCs w:val="28"/>
-          <w:lang w:eastAsia="uk-UA"/>
-        </w:rPr>
-      </w:pPr>
-      <w:proofErr w:type="spellStart"/>
-      <w:proofErr w:type="spellEnd"/>
-      <w:r>
-        <w:rPr>
-          <w:rFonts w:ascii="Courier New" w:eastAsia="Times New Roman" w:hAnsi="Courier New" w:cs="Courier New"/>
-          <w:sz w:val="20"/>
-          <w:szCs w:val="28"/>
-          <w:lang w:eastAsia="uk-UA"/>
-        </w:rPr>
-        <w:t>console.log("Місто:", person.city);</w:t>
-      </w:r>
-    </w:p>
-    <w:p>
-      <w:pPr>
-        <w:spacing w:after="0" w:line="228" w:lineRule="auto" w:before="0"/>
-        <w:rPr>
-          <w:rFonts w:ascii="Courier New" w:eastAsia="Times New Roman" w:hAnsi="Courier New" w:cs="Courier New"/>
-          <w:szCs w:val="28"/>
-          <w:lang w:eastAsia="uk-UA"/>
-        </w:rPr>
-      </w:pPr>
-      <w:proofErr w:type="spellStart"/>
-      <w:proofErr w:type="spellEnd"/>
-      <w:r>
-        <w:rPr>
-          <w:rFonts w:ascii="Courier New" w:eastAsia="Times New Roman" w:hAnsi="Courier New" w:cs="Courier New"/>
-          <w:sz w:val="20"/>
-          <w:szCs w:val="28"/>
-          <w:lang w:eastAsia="uk-UA"/>
-        </w:rPr>
-        <w:t xml:space="preserve"> </w:t>
-      </w:r>
-    </w:p>
-    <w:p>
-      <w:pPr>
-        <w:spacing w:after="0" w:line="228" w:lineRule="auto" w:before="0"/>
-        <w:rPr>
-          <w:rFonts w:ascii="Courier New" w:eastAsia="Times New Roman" w:hAnsi="Courier New" w:cs="Courier New"/>
-          <w:szCs w:val="28"/>
-          <w:lang w:eastAsia="uk-UA"/>
-        </w:rPr>
-      </w:pPr>
-      <w:proofErr w:type="spellStart"/>
-      <w:proofErr w:type="spellEnd"/>
-      <w:r>
-        <w:rPr>
-          <w:rFonts w:ascii="Courier New" w:eastAsia="Times New Roman" w:hAnsi="Courier New" w:cs="Courier New"/>
-          <w:sz w:val="20"/>
-          <w:szCs w:val="28"/>
-          <w:lang w:eastAsia="uk-UA"/>
-        </w:rPr>
-        <w:t>// 3. Масив чисел і цикл for</w:t>
-      </w:r>
-    </w:p>
-    <w:p>
-      <w:pPr>
-        <w:spacing w:after="0" w:line="228" w:lineRule="auto" w:before="0"/>
-        <w:rPr>
-          <w:rFonts w:ascii="Courier New" w:eastAsia="Times New Roman" w:hAnsi="Courier New" w:cs="Courier New"/>
-          <w:szCs w:val="28"/>
-          <w:lang w:eastAsia="uk-UA"/>
-        </w:rPr>
-      </w:pPr>
-      <w:proofErr w:type="spellStart"/>
-      <w:proofErr w:type="spellEnd"/>
-      <w:r>
-        <w:rPr>
-          <w:rFonts w:ascii="Courier New" w:eastAsia="Times New Roman" w:hAnsi="Courier New" w:cs="Courier New"/>
-          <w:sz w:val="20"/>
-          <w:szCs w:val="28"/>
-          <w:lang w:eastAsia="uk-UA"/>
-        </w:rPr>
-        <w:t>console.log("Завдання 3:");</w:t>
-      </w:r>
-    </w:p>
-    <w:p>
-      <w:pPr>
-        <w:spacing w:after="0" w:line="228" w:lineRule="auto" w:before="0"/>
-        <w:rPr>
-          <w:rFonts w:ascii="Courier New" w:eastAsia="Times New Roman" w:hAnsi="Courier New" w:cs="Courier New"/>
-          <w:szCs w:val="28"/>
-          <w:lang w:eastAsia="uk-UA"/>
-        </w:rPr>
-      </w:pPr>
-      <w:proofErr w:type="spellStart"/>
-      <w:proofErr w:type="spellEnd"/>
-      <w:r>
-        <w:rPr>
-          <w:rFonts w:ascii="Courier New" w:eastAsia="Times New Roman" w:hAnsi="Courier New" w:cs="Courier New"/>
-          <w:sz w:val="20"/>
-          <w:szCs w:val="28"/>
-          <w:lang w:eastAsia="uk-UA"/>
-        </w:rPr>
-        <w:t xml:space="preserve"> </w:t>
-      </w:r>
-    </w:p>
-    <w:p>
-      <w:pPr>
-        <w:spacing w:after="0" w:line="228" w:lineRule="auto" w:before="0"/>
-        <w:rPr>
-          <w:rFonts w:ascii="Courier New" w:eastAsia="Times New Roman" w:hAnsi="Courier New" w:cs="Courier New"/>
-          <w:szCs w:val="28"/>
-          <w:lang w:eastAsia="uk-UA"/>
-        </w:rPr>
-      </w:pPr>
-      <w:proofErr w:type="spellStart"/>
-      <w:proofErr w:type="spellEnd"/>
-      <w:r>
-        <w:rPr>
-          <w:rFonts w:ascii="Courier New" w:eastAsia="Times New Roman" w:hAnsi="Courier New" w:cs="Courier New"/>
-          <w:sz w:val="20"/>
-          <w:szCs w:val="28"/>
-          <w:lang w:eastAsia="uk-UA"/>
-        </w:rPr>
-        <w:t>var numbers = [3, 8, 15, 22, 7];</w:t>
-      </w:r>
-    </w:p>
-    <w:p>
-      <w:pPr>
-        <w:spacing w:after="0" w:line="228" w:lineRule="auto" w:before="0"/>
-        <w:rPr>
-          <w:rFonts w:ascii="Courier New" w:eastAsia="Times New Roman" w:hAnsi="Courier New" w:cs="Courier New"/>
-          <w:szCs w:val="28"/>
-          <w:lang w:eastAsia="uk-UA"/>
-        </w:rPr>
-      </w:pPr>
-      <w:proofErr w:type="spellStart"/>
-      <w:proofErr w:type="spellEnd"/>
-      <w:r>
-        <w:rPr>
-          <w:rFonts w:ascii="Courier New" w:eastAsia="Times New Roman" w:hAnsi="Courier New" w:cs="Courier New"/>
-          <w:sz w:val="20"/>
-          <w:szCs w:val="28"/>
-          <w:lang w:eastAsia="uk-UA"/>
-        </w:rPr>
-        <w:t xml:space="preserve"> </w:t>
-      </w:r>
-    </w:p>
-    <w:p>
-      <w:pPr>
-        <w:spacing w:after="0" w:line="228" w:lineRule="auto" w:before="0"/>
-        <w:rPr>
-          <w:rFonts w:ascii="Courier New" w:eastAsia="Times New Roman" w:hAnsi="Courier New" w:cs="Courier New"/>
-          <w:szCs w:val="28"/>
-          <w:lang w:eastAsia="uk-UA"/>
-        </w:rPr>
-      </w:pPr>
-      <w:proofErr w:type="spellStart"/>
-      <w:proofErr w:type="spellEnd"/>
-      <w:r>
-        <w:rPr>
-          <w:rFonts w:ascii="Courier New" w:eastAsia="Times New Roman" w:hAnsi="Courier New" w:cs="Courier New"/>
-          <w:sz w:val="20"/>
-          <w:szCs w:val="28"/>
-          <w:lang w:eastAsia="uk-UA"/>
-        </w:rPr>
-        <w:t>for (var i = 0; i &lt; numbers.length; i++) {</w:t>
-      </w:r>
-    </w:p>
-    <w:p>
-      <w:pPr>
-        <w:spacing w:after="0" w:line="228" w:lineRule="auto" w:before="0"/>
-        <w:rPr>
-          <w:rFonts w:ascii="Courier New" w:eastAsia="Times New Roman" w:hAnsi="Courier New" w:cs="Courier New"/>
-          <w:szCs w:val="28"/>
-          <w:lang w:eastAsia="uk-UA"/>
-        </w:rPr>
-      </w:pPr>
-      <w:proofErr w:type="spellStart"/>
-      <w:proofErr w:type="spellEnd"/>
-      <w:r>
-        <w:rPr>
-          <w:rFonts w:ascii="Courier New" w:eastAsia="Times New Roman" w:hAnsi="Courier New" w:cs="Courier New"/>
-          <w:sz w:val="20"/>
-          <w:szCs w:val="28"/>
-          <w:lang w:eastAsia="uk-UA"/>
-        </w:rPr>
-        <w:t xml:space="preserve">    console.log(numbers[i]);</w:t>
-      </w:r>
-    </w:p>
-    <w:p>
-      <w:pPr>
-        <w:spacing w:after="0" w:line="228" w:lineRule="auto" w:before="0"/>
-        <w:rPr>
-          <w:rFonts w:ascii="Courier New" w:eastAsia="Times New Roman" w:hAnsi="Courier New" w:cs="Courier New"/>
-          <w:szCs w:val="28"/>
-          <w:lang w:eastAsia="uk-UA"/>
-        </w:rPr>
-      </w:pPr>
-      <w:proofErr w:type="spellStart"/>
-      <w:proofErr w:type="spellEnd"/>
-      <w:r>
-        <w:rPr>
-          <w:rFonts w:ascii="Courier New" w:eastAsia="Times New Roman" w:hAnsi="Courier New" w:cs="Courier New"/>
-          <w:sz w:val="20"/>
-          <w:szCs w:val="28"/>
-          <w:lang w:eastAsia="uk-UA"/>
-        </w:rPr>
-        <w:t>}</w:t>
-      </w:r>
+          <w:lang w:val="en-US" w:eastAsia="uk-UA"/>
+        </w:rPr>
+      </w:pPr>
     </w:p>
     <w:p>
       <w:pPr>
@@ -1651,11 +737,881 @@
         <w:rPr>
           <w:rFonts w:eastAsia="Times New Roman" w:cs="Times New Roman"/>
           <w:szCs w:val="28"/>
-          <w:lang w:eastAsia="uk-UA"/>
-        </w:rPr>
-      </w:pPr>
-      <w:proofErr w:type="spellStart"/>
-      <w:proofErr w:type="spellEnd"/>
+          <w:lang w:val="en-US" w:eastAsia="uk-UA"/>
+        </w:rPr>
+      </w:pPr>
+    </w:p>
+    <w:p>
+      <w:pPr>
+        <w:spacing w:after="0" w:line="360" w:lineRule="auto"/>
+        <w:ind w:firstLine="426"/>
+        <w:jc w:val="both"/>
+        <w:rPr>
+          <w:rFonts w:eastAsia="Times New Roman" w:cs="Times New Roman"/>
+          <w:szCs w:val="28"/>
+          <w:lang w:val="en-US" w:eastAsia="uk-UA"/>
+        </w:rPr>
+      </w:pPr>
+    </w:p>
+    <w:p>
+      <w:pPr>
+        <w:spacing w:after="0" w:line="360" w:lineRule="auto"/>
+        <w:ind w:firstLine="851"/>
+        <w:jc w:val="both"/>
+        <w:rPr>
+          <w:rFonts w:eastAsia="Times New Roman" w:cs="Times New Roman"/>
+          <w:szCs w:val="28"/>
+          <w:lang w:eastAsia="uk-UA"/>
+        </w:rPr>
+      </w:pPr>
+      <w:r>
+        <w:rPr>
+          <w:rFonts w:eastAsia="Times New Roman" w:cs="Times New Roman"/>
+          <w:szCs w:val="28"/>
+          <w:lang w:eastAsia="uk-UA"/>
+        </w:rPr>
+        <w:t>Код програми script.js:</w:t>
+      </w:r>
+    </w:p>
+    <w:p>
+      <w:pPr>
+        <w:spacing w:after="0" w:line="228" w:lineRule="auto"/>
+        <w:rPr>
+          <w:rFonts w:ascii="Courier New" w:eastAsia="Times New Roman" w:hAnsi="Courier New" w:cs="Courier New"/>
+          <w:sz w:val="40"/>
+          <w:szCs w:val="40"/>
+          <w:lang w:eastAsia="uk-UA"/>
+        </w:rPr>
+      </w:pPr>
+      <w:r>
+        <w:rPr>
+          <w:rFonts w:ascii="Courier New" w:eastAsia="Times New Roman" w:hAnsi="Courier New" w:cs="Courier New"/>
+          <w:szCs w:val="40"/>
+          <w:lang w:eastAsia="uk-UA"/>
+        </w:rPr>
+        <w:t>// =========================================================</w:t>
+      </w:r>
+    </w:p>
+    <w:p>
+      <w:pPr>
+        <w:spacing w:after="0" w:line="228" w:lineRule="auto"/>
+        <w:rPr>
+          <w:rFonts w:ascii="Courier New" w:eastAsia="Times New Roman" w:hAnsi="Courier New" w:cs="Courier New"/>
+          <w:sz w:val="40"/>
+          <w:szCs w:val="40"/>
+          <w:lang w:eastAsia="uk-UA"/>
+        </w:rPr>
+      </w:pPr>
+      <w:r>
+        <w:rPr>
+          <w:rFonts w:ascii="Courier New" w:eastAsia="Times New Roman" w:hAnsi="Courier New" w:cs="Courier New"/>
+          <w:szCs w:val="40"/>
+          <w:lang w:eastAsia="uk-UA"/>
+        </w:rPr>
+        <w:t>// Лабораторна робота №11. Варіант 1</w:t>
+      </w:r>
+    </w:p>
+    <w:p>
+      <w:pPr>
+        <w:spacing w:after="0" w:line="228" w:lineRule="auto"/>
+        <w:rPr>
+          <w:rFonts w:ascii="Courier New" w:eastAsia="Times New Roman" w:hAnsi="Courier New" w:cs="Courier New"/>
+          <w:sz w:val="40"/>
+          <w:szCs w:val="40"/>
+          <w:lang w:eastAsia="uk-UA"/>
+        </w:rPr>
+      </w:pPr>
+      <w:r>
+        <w:rPr>
+          <w:rFonts w:ascii="Courier New" w:eastAsia="Times New Roman" w:hAnsi="Courier New" w:cs="Courier New"/>
+          <w:szCs w:val="40"/>
+          <w:lang w:eastAsia="uk-UA"/>
+        </w:rPr>
+        <w:t>// Тема: масиви, об'єкти та функції у JavaScript</w:t>
+      </w:r>
+    </w:p>
+    <w:p>
+      <w:pPr>
+        <w:spacing w:after="0" w:line="228" w:lineRule="auto"/>
+        <w:rPr>
+          <w:rFonts w:ascii="Courier New" w:eastAsia="Times New Roman" w:hAnsi="Courier New" w:cs="Courier New"/>
+          <w:sz w:val="40"/>
+          <w:szCs w:val="40"/>
+          <w:lang w:eastAsia="uk-UA"/>
+        </w:rPr>
+      </w:pPr>
+      <w:r>
+        <w:rPr>
+          <w:rFonts w:ascii="Courier New" w:eastAsia="Times New Roman" w:hAnsi="Courier New" w:cs="Courier New"/>
+          <w:szCs w:val="40"/>
+          <w:lang w:eastAsia="uk-UA"/>
+        </w:rPr>
+        <w:t>//</w:t>
+      </w:r>
+    </w:p>
+    <w:p>
+      <w:pPr>
+        <w:spacing w:after="0" w:line="228" w:lineRule="auto"/>
+        <w:rPr>
+          <w:rFonts w:ascii="Courier New" w:eastAsia="Times New Roman" w:hAnsi="Courier New" w:cs="Courier New"/>
+          <w:sz w:val="40"/>
+          <w:szCs w:val="40"/>
+          <w:lang w:eastAsia="uk-UA"/>
+        </w:rPr>
+      </w:pPr>
+      <w:r>
+        <w:rPr>
+          <w:rFonts w:ascii="Courier New" w:eastAsia="Times New Roman" w:hAnsi="Courier New" w:cs="Courier New"/>
+          <w:szCs w:val="40"/>
+          <w:lang w:eastAsia="uk-UA"/>
+        </w:rPr>
+        <w:t>// Завдання 1: функція greet, що приймає ім'я та прізвище</w:t>
+      </w:r>
+    </w:p>
+    <w:p>
+      <w:pPr>
+        <w:spacing w:after="0" w:line="228" w:lineRule="auto"/>
+        <w:rPr>
+          <w:rFonts w:ascii="Courier New" w:eastAsia="Times New Roman" w:hAnsi="Courier New" w:cs="Courier New"/>
+          <w:sz w:val="40"/>
+          <w:szCs w:val="40"/>
+          <w:lang w:eastAsia="uk-UA"/>
+        </w:rPr>
+      </w:pPr>
+      <w:r>
+        <w:rPr>
+          <w:rFonts w:ascii="Courier New" w:eastAsia="Times New Roman" w:hAnsi="Courier New" w:cs="Courier New"/>
+          <w:szCs w:val="40"/>
+          <w:lang w:eastAsia="uk-UA"/>
+        </w:rPr>
+        <w:t>//             і виводить вітальне повідомлення в консоль.</w:t>
+      </w:r>
+    </w:p>
+    <w:p>
+      <w:pPr>
+        <w:spacing w:after="0" w:line="228" w:lineRule="auto"/>
+        <w:rPr>
+          <w:rFonts w:ascii="Courier New" w:eastAsia="Times New Roman" w:hAnsi="Courier New" w:cs="Courier New"/>
+          <w:sz w:val="40"/>
+          <w:szCs w:val="40"/>
+          <w:lang w:eastAsia="uk-UA"/>
+        </w:rPr>
+      </w:pPr>
+      <w:r>
+        <w:rPr>
+          <w:rFonts w:ascii="Courier New" w:eastAsia="Times New Roman" w:hAnsi="Courier New" w:cs="Courier New"/>
+          <w:szCs w:val="40"/>
+          <w:lang w:eastAsia="uk-UA"/>
+        </w:rPr>
+        <w:t>// Завдання 2: об'єкт person з іменем, віком та електронною</w:t>
+      </w:r>
+    </w:p>
+    <w:p>
+      <w:pPr>
+        <w:spacing w:after="0" w:line="228" w:lineRule="auto"/>
+        <w:rPr>
+          <w:rFonts w:ascii="Courier New" w:eastAsia="Times New Roman" w:hAnsi="Courier New" w:cs="Courier New"/>
+          <w:sz w:val="40"/>
+          <w:szCs w:val="40"/>
+          <w:lang w:eastAsia="uk-UA"/>
+        </w:rPr>
+      </w:pPr>
+      <w:r>
+        <w:rPr>
+          <w:rFonts w:ascii="Courier New" w:eastAsia="Times New Roman" w:hAnsi="Courier New" w:cs="Courier New"/>
+          <w:szCs w:val="40"/>
+          <w:lang w:eastAsia="uk-UA"/>
+        </w:rPr>
+        <w:t>//             адресою; додати нову властивість і вивести її.</w:t>
+      </w:r>
+    </w:p>
+    <w:p>
+      <w:pPr>
+        <w:spacing w:after="0" w:line="228" w:lineRule="auto"/>
+        <w:rPr>
+          <w:rFonts w:ascii="Courier New" w:eastAsia="Times New Roman" w:hAnsi="Courier New" w:cs="Courier New"/>
+          <w:sz w:val="40"/>
+          <w:szCs w:val="40"/>
+          <w:lang w:eastAsia="uk-UA"/>
+        </w:rPr>
+      </w:pPr>
+      <w:r>
+        <w:rPr>
+          <w:rFonts w:ascii="Courier New" w:eastAsia="Times New Roman" w:hAnsi="Courier New" w:cs="Courier New"/>
+          <w:szCs w:val="40"/>
+          <w:lang w:eastAsia="uk-UA"/>
+        </w:rPr>
+        <w:t>// Завдання 3: масив чисел і виведення його циклом for.</w:t>
+      </w:r>
+    </w:p>
+    <w:p>
+      <w:pPr>
+        <w:spacing w:after="0" w:line="228" w:lineRule="auto"/>
+        <w:rPr>
+          <w:rFonts w:ascii="Courier New" w:eastAsia="Times New Roman" w:hAnsi="Courier New" w:cs="Courier New"/>
+          <w:sz w:val="40"/>
+          <w:szCs w:val="40"/>
+          <w:lang w:eastAsia="uk-UA"/>
+        </w:rPr>
+      </w:pPr>
+      <w:r>
+        <w:rPr>
+          <w:rFonts w:ascii="Courier New" w:eastAsia="Times New Roman" w:hAnsi="Courier New" w:cs="Courier New"/>
+          <w:szCs w:val="40"/>
+          <w:lang w:eastAsia="uk-UA"/>
+        </w:rPr>
+        <w:t>// =========================================================</w:t>
+      </w:r>
+    </w:p>
+    <w:p>
+      <w:pPr>
+        <w:spacing w:after="0" w:line="228" w:lineRule="auto"/>
+        <w:rPr>
+          <w:rFonts w:ascii="Courier New" w:eastAsia="Times New Roman" w:hAnsi="Courier New" w:cs="Courier New"/>
+          <w:sz w:val="40"/>
+          <w:szCs w:val="40"/>
+          <w:lang w:eastAsia="uk-UA"/>
+        </w:rPr>
+      </w:pPr>
+      <w:r>
+        <w:rPr>
+          <w:rFonts w:ascii="Courier New" w:eastAsia="Times New Roman" w:hAnsi="Courier New" w:cs="Courier New"/>
+          <w:szCs w:val="40"/>
+          <w:lang w:eastAsia="uk-UA"/>
+        </w:rPr>
+        <w:t xml:space="preserve"> </w:t>
+      </w:r>
+    </w:p>
+    <w:p>
+      <w:pPr>
+        <w:spacing w:after="0" w:line="228" w:lineRule="auto"/>
+        <w:rPr>
+          <w:rFonts w:ascii="Courier New" w:eastAsia="Times New Roman" w:hAnsi="Courier New" w:cs="Courier New"/>
+          <w:sz w:val="40"/>
+          <w:szCs w:val="40"/>
+          <w:lang w:eastAsia="uk-UA"/>
+        </w:rPr>
+      </w:pPr>
+      <w:r>
+        <w:rPr>
+          <w:rFonts w:ascii="Courier New" w:eastAsia="Times New Roman" w:hAnsi="Courier New" w:cs="Courier New"/>
+          <w:szCs w:val="40"/>
+          <w:lang w:eastAsia="uk-UA"/>
+        </w:rPr>
+        <w:t>// 1. Функція вітання</w:t>
+      </w:r>
+    </w:p>
+    <w:p>
+      <w:pPr>
+        <w:spacing w:after="0" w:line="228" w:lineRule="auto"/>
+        <w:rPr>
+          <w:rFonts w:ascii="Courier New" w:eastAsia="Times New Roman" w:hAnsi="Courier New" w:cs="Courier New"/>
+          <w:sz w:val="40"/>
+          <w:szCs w:val="40"/>
+          <w:lang w:eastAsia="uk-UA"/>
+        </w:rPr>
+      </w:pPr>
+      <w:r>
+        <w:rPr>
+          <w:rFonts w:ascii="Courier New" w:eastAsia="Times New Roman" w:hAnsi="Courier New" w:cs="Courier New"/>
+          <w:szCs w:val="40"/>
+          <w:lang w:eastAsia="uk-UA"/>
+        </w:rPr>
+        <w:t>console.log("Завдання 1:");</w:t>
+      </w:r>
+    </w:p>
+    <w:p>
+      <w:pPr>
+        <w:spacing w:after="0" w:line="228" w:lineRule="auto"/>
+        <w:rPr>
+          <w:rFonts w:ascii="Courier New" w:eastAsia="Times New Roman" w:hAnsi="Courier New" w:cs="Courier New"/>
+          <w:sz w:val="40"/>
+          <w:szCs w:val="40"/>
+          <w:lang w:eastAsia="uk-UA"/>
+        </w:rPr>
+      </w:pPr>
+      <w:r>
+        <w:rPr>
+          <w:rFonts w:ascii="Courier New" w:eastAsia="Times New Roman" w:hAnsi="Courier New" w:cs="Courier New"/>
+          <w:szCs w:val="40"/>
+          <w:lang w:eastAsia="uk-UA"/>
+        </w:rPr>
+        <w:t xml:space="preserve"> </w:t>
+      </w:r>
+    </w:p>
+    <w:p>
+      <w:pPr>
+        <w:spacing w:after="0" w:line="228" w:lineRule="auto"/>
+        <w:rPr>
+          <w:rFonts w:ascii="Courier New" w:eastAsia="Times New Roman" w:hAnsi="Courier New" w:cs="Courier New"/>
+          <w:sz w:val="40"/>
+          <w:szCs w:val="40"/>
+          <w:lang w:eastAsia="uk-UA"/>
+        </w:rPr>
+      </w:pPr>
+      <w:r>
+        <w:rPr>
+          <w:rFonts w:ascii="Courier New" w:eastAsia="Times New Roman" w:hAnsi="Courier New" w:cs="Courier New"/>
+          <w:szCs w:val="40"/>
+          <w:lang w:eastAsia="uk-UA"/>
+        </w:rPr>
+        <w:t>function greet(firstName, lastName) {</w:t>
+      </w:r>
+    </w:p>
+    <w:p>
+      <w:pPr>
+        <w:spacing w:after="0" w:line="228" w:lineRule="auto"/>
+        <w:rPr>
+          <w:rFonts w:ascii="Courier New" w:eastAsia="Times New Roman" w:hAnsi="Courier New" w:cs="Courier New"/>
+          <w:sz w:val="40"/>
+          <w:szCs w:val="40"/>
+          <w:lang w:eastAsia="uk-UA"/>
+        </w:rPr>
+      </w:pPr>
+      <w:r>
+        <w:rPr>
+          <w:rFonts w:ascii="Courier New" w:eastAsia="Times New Roman" w:hAnsi="Courier New" w:cs="Courier New"/>
+          <w:szCs w:val="40"/>
+          <w:lang w:eastAsia="uk-UA"/>
+        </w:rPr>
+        <w:t xml:space="preserve">    console.log("Привіт, " + firstName + " " + lastName + "!");</w:t>
+      </w:r>
+    </w:p>
+    <w:p>
+      <w:pPr>
+        <w:spacing w:after="0" w:line="228" w:lineRule="auto"/>
+        <w:rPr>
+          <w:rFonts w:ascii="Courier New" w:eastAsia="Times New Roman" w:hAnsi="Courier New" w:cs="Courier New"/>
+          <w:sz w:val="40"/>
+          <w:szCs w:val="40"/>
+          <w:lang w:eastAsia="uk-UA"/>
+        </w:rPr>
+      </w:pPr>
+      <w:r>
+        <w:rPr>
+          <w:rFonts w:ascii="Courier New" w:eastAsia="Times New Roman" w:hAnsi="Courier New" w:cs="Courier New"/>
+          <w:szCs w:val="40"/>
+          <w:lang w:eastAsia="uk-UA"/>
+        </w:rPr>
+        <w:t>}</w:t>
+      </w:r>
+    </w:p>
+    <w:p>
+      <w:pPr>
+        <w:spacing w:after="0" w:line="228" w:lineRule="auto"/>
+        <w:rPr>
+          <w:rFonts w:ascii="Courier New" w:eastAsia="Times New Roman" w:hAnsi="Courier New" w:cs="Courier New"/>
+          <w:sz w:val="40"/>
+          <w:szCs w:val="40"/>
+          <w:lang w:eastAsia="uk-UA"/>
+        </w:rPr>
+      </w:pPr>
+      <w:r>
+        <w:rPr>
+          <w:rFonts w:ascii="Courier New" w:eastAsia="Times New Roman" w:hAnsi="Courier New" w:cs="Courier New"/>
+          <w:szCs w:val="40"/>
+          <w:lang w:eastAsia="uk-UA"/>
+        </w:rPr>
+        <w:t xml:space="preserve"> </w:t>
+      </w:r>
+    </w:p>
+    <w:p>
+      <w:pPr>
+        <w:spacing w:after="0" w:line="228" w:lineRule="auto"/>
+        <w:rPr>
+          <w:rFonts w:ascii="Courier New" w:eastAsia="Times New Roman" w:hAnsi="Courier New" w:cs="Courier New"/>
+          <w:sz w:val="40"/>
+          <w:szCs w:val="40"/>
+          <w:lang w:eastAsia="uk-UA"/>
+        </w:rPr>
+      </w:pPr>
+      <w:r>
+        <w:rPr>
+          <w:rFonts w:ascii="Courier New" w:eastAsia="Times New Roman" w:hAnsi="Courier New" w:cs="Courier New"/>
+          <w:szCs w:val="40"/>
+          <w:lang w:eastAsia="uk-UA"/>
+        </w:rPr>
+        <w:t>greet("Богдан", "Рафієв");</w:t>
+      </w:r>
+    </w:p>
+    <w:p>
+      <w:pPr>
+        <w:spacing w:after="0" w:line="228" w:lineRule="auto"/>
+        <w:rPr>
+          <w:rFonts w:ascii="Courier New" w:eastAsia="Times New Roman" w:hAnsi="Courier New" w:cs="Courier New"/>
+          <w:sz w:val="40"/>
+          <w:szCs w:val="40"/>
+          <w:lang w:eastAsia="uk-UA"/>
+        </w:rPr>
+      </w:pPr>
+      <w:r>
+        <w:rPr>
+          <w:rFonts w:ascii="Courier New" w:eastAsia="Times New Roman" w:hAnsi="Courier New" w:cs="Courier New"/>
+          <w:szCs w:val="40"/>
+          <w:lang w:eastAsia="uk-UA"/>
+        </w:rPr>
+        <w:t xml:space="preserve"> </w:t>
+      </w:r>
+    </w:p>
+    <w:p>
+      <w:pPr>
+        <w:spacing w:after="0" w:line="228" w:lineRule="auto"/>
+        <w:rPr>
+          <w:rFonts w:ascii="Courier New" w:eastAsia="Times New Roman" w:hAnsi="Courier New" w:cs="Courier New"/>
+          <w:sz w:val="40"/>
+          <w:szCs w:val="40"/>
+          <w:lang w:eastAsia="uk-UA"/>
+        </w:rPr>
+      </w:pPr>
+      <w:r>
+        <w:rPr>
+          <w:rFonts w:ascii="Courier New" w:eastAsia="Times New Roman" w:hAnsi="Courier New" w:cs="Courier New"/>
+          <w:szCs w:val="40"/>
+          <w:lang w:eastAsia="uk-UA"/>
+        </w:rPr>
+        <w:t>// 2. Об'єкт, що представляє людину</w:t>
+      </w:r>
+    </w:p>
+    <w:p>
+      <w:pPr>
+        <w:spacing w:after="0" w:line="228" w:lineRule="auto"/>
+        <w:rPr>
+          <w:rFonts w:ascii="Courier New" w:eastAsia="Times New Roman" w:hAnsi="Courier New" w:cs="Courier New"/>
+          <w:sz w:val="40"/>
+          <w:szCs w:val="40"/>
+          <w:lang w:eastAsia="uk-UA"/>
+        </w:rPr>
+      </w:pPr>
+      <w:r>
+        <w:rPr>
+          <w:rFonts w:ascii="Courier New" w:eastAsia="Times New Roman" w:hAnsi="Courier New" w:cs="Courier New"/>
+          <w:szCs w:val="40"/>
+          <w:lang w:eastAsia="uk-UA"/>
+        </w:rPr>
+        <w:t>console.log("Завдання 2:");</w:t>
+      </w:r>
+    </w:p>
+    <w:p>
+      <w:pPr>
+        <w:spacing w:after="0" w:line="228" w:lineRule="auto"/>
+        <w:rPr>
+          <w:rFonts w:ascii="Courier New" w:eastAsia="Times New Roman" w:hAnsi="Courier New" w:cs="Courier New"/>
+          <w:sz w:val="40"/>
+          <w:szCs w:val="40"/>
+          <w:lang w:eastAsia="uk-UA"/>
+        </w:rPr>
+      </w:pPr>
+      <w:r>
+        <w:rPr>
+          <w:rFonts w:ascii="Courier New" w:eastAsia="Times New Roman" w:hAnsi="Courier New" w:cs="Courier New"/>
+          <w:szCs w:val="40"/>
+          <w:lang w:eastAsia="uk-UA"/>
+        </w:rPr>
+        <w:t xml:space="preserve"> </w:t>
+      </w:r>
+    </w:p>
+    <w:p>
+      <w:pPr>
+        <w:spacing w:after="0" w:line="228" w:lineRule="auto"/>
+        <w:rPr>
+          <w:rFonts w:ascii="Courier New" w:eastAsia="Times New Roman" w:hAnsi="Courier New" w:cs="Courier New"/>
+          <w:sz w:val="40"/>
+          <w:szCs w:val="40"/>
+          <w:lang w:eastAsia="uk-UA"/>
+        </w:rPr>
+      </w:pPr>
+      <w:r>
+        <w:rPr>
+          <w:rFonts w:ascii="Courier New" w:eastAsia="Times New Roman" w:hAnsi="Courier New" w:cs="Courier New"/>
+          <w:szCs w:val="40"/>
+          <w:lang w:eastAsia="uk-UA"/>
+        </w:rPr>
+        <w:t>var person = {</w:t>
+      </w:r>
+    </w:p>
+    <w:p>
+      <w:pPr>
+        <w:spacing w:after="0" w:line="228" w:lineRule="auto"/>
+        <w:rPr>
+          <w:rFonts w:ascii="Courier New" w:eastAsia="Times New Roman" w:hAnsi="Courier New" w:cs="Courier New"/>
+          <w:sz w:val="40"/>
+          <w:szCs w:val="40"/>
+          <w:lang w:eastAsia="uk-UA"/>
+        </w:rPr>
+      </w:pPr>
+      <w:r>
+        <w:rPr>
+          <w:rFonts w:ascii="Courier New" w:eastAsia="Times New Roman" w:hAnsi="Courier New" w:cs="Courier New"/>
+          <w:szCs w:val="40"/>
+          <w:lang w:eastAsia="uk-UA"/>
+        </w:rPr>
+        <w:t xml:space="preserve">    name: "Богдан",</w:t>
+      </w:r>
+    </w:p>
+    <w:p>
+      <w:pPr>
+        <w:spacing w:after="0" w:line="228" w:lineRule="auto"/>
+        <w:rPr>
+          <w:rFonts w:ascii="Courier New" w:eastAsia="Times New Roman" w:hAnsi="Courier New" w:cs="Courier New"/>
+          <w:sz w:val="40"/>
+          <w:szCs w:val="40"/>
+          <w:lang w:eastAsia="uk-UA"/>
+        </w:rPr>
+      </w:pPr>
+      <w:r>
+        <w:rPr>
+          <w:rFonts w:ascii="Courier New" w:eastAsia="Times New Roman" w:hAnsi="Courier New" w:cs="Courier New"/>
+          <w:szCs w:val="40"/>
+          <w:lang w:eastAsia="uk-UA"/>
+        </w:rPr>
+        <w:t xml:space="preserve">    age: 20,</w:t>
+      </w:r>
+    </w:p>
+    <w:p>
+      <w:pPr>
+        <w:spacing w:after="0" w:line="228" w:lineRule="auto"/>
+        <w:rPr>
+          <w:rFonts w:ascii="Courier New" w:eastAsia="Times New Roman" w:hAnsi="Courier New" w:cs="Courier New"/>
+          <w:sz w:val="40"/>
+          <w:szCs w:val="40"/>
+          <w:lang w:eastAsia="uk-UA"/>
+        </w:rPr>
+      </w:pPr>
+      <w:r>
+        <w:rPr>
+          <w:rFonts w:ascii="Courier New" w:eastAsia="Times New Roman" w:hAnsi="Courier New" w:cs="Courier New"/>
+          <w:szCs w:val="40"/>
+          <w:lang w:eastAsia="uk-UA"/>
+        </w:rPr>
+        <w:t xml:space="preserve">    email: "bohdan.rafiev@example.com"</w:t>
+      </w:r>
+    </w:p>
+    <w:p>
+      <w:pPr>
+        <w:spacing w:after="0" w:line="228" w:lineRule="auto"/>
+        <w:rPr>
+          <w:rFonts w:ascii="Courier New" w:eastAsia="Times New Roman" w:hAnsi="Courier New" w:cs="Courier New"/>
+          <w:sz w:val="40"/>
+          <w:szCs w:val="40"/>
+          <w:lang w:eastAsia="uk-UA"/>
+        </w:rPr>
+      </w:pPr>
+      <w:r>
+        <w:rPr>
+          <w:rFonts w:ascii="Courier New" w:eastAsia="Times New Roman" w:hAnsi="Courier New" w:cs="Courier New"/>
+          <w:szCs w:val="40"/>
+          <w:lang w:eastAsia="uk-UA"/>
+        </w:rPr>
+        <w:t>};</w:t>
+      </w:r>
+    </w:p>
+    <w:p>
+      <w:pPr>
+        <w:spacing w:after="0" w:line="228" w:lineRule="auto"/>
+        <w:rPr>
+          <w:rFonts w:ascii="Courier New" w:eastAsia="Times New Roman" w:hAnsi="Courier New" w:cs="Courier New"/>
+          <w:sz w:val="40"/>
+          <w:szCs w:val="40"/>
+          <w:lang w:eastAsia="uk-UA"/>
+        </w:rPr>
+      </w:pPr>
+      <w:r>
+        <w:rPr>
+          <w:rFonts w:ascii="Courier New" w:eastAsia="Times New Roman" w:hAnsi="Courier New" w:cs="Courier New"/>
+          <w:szCs w:val="40"/>
+          <w:lang w:eastAsia="uk-UA"/>
+        </w:rPr>
+        <w:t xml:space="preserve"> </w:t>
+      </w:r>
+    </w:p>
+    <w:p>
+      <w:pPr>
+        <w:spacing w:after="0" w:line="228" w:lineRule="auto"/>
+        <w:rPr>
+          <w:rFonts w:ascii="Courier New" w:eastAsia="Times New Roman" w:hAnsi="Courier New" w:cs="Courier New"/>
+          <w:sz w:val="40"/>
+          <w:szCs w:val="40"/>
+          <w:lang w:eastAsia="uk-UA"/>
+        </w:rPr>
+      </w:pPr>
+      <w:r>
+        <w:rPr>
+          <w:rFonts w:ascii="Courier New" w:eastAsia="Times New Roman" w:hAnsi="Courier New" w:cs="Courier New"/>
+          <w:szCs w:val="40"/>
+          <w:lang w:eastAsia="uk-UA"/>
+        </w:rPr>
+        <w:t>console.log("Ім'я:", person.name);</w:t>
+      </w:r>
+    </w:p>
+    <w:p>
+      <w:pPr>
+        <w:spacing w:after="0" w:line="228" w:lineRule="auto"/>
+        <w:rPr>
+          <w:rFonts w:ascii="Courier New" w:eastAsia="Times New Roman" w:hAnsi="Courier New" w:cs="Courier New"/>
+          <w:sz w:val="40"/>
+          <w:szCs w:val="40"/>
+          <w:lang w:eastAsia="uk-UA"/>
+        </w:rPr>
+      </w:pPr>
+      <w:r>
+        <w:rPr>
+          <w:rFonts w:ascii="Courier New" w:eastAsia="Times New Roman" w:hAnsi="Courier New" w:cs="Courier New"/>
+          <w:szCs w:val="40"/>
+          <w:lang w:eastAsia="uk-UA"/>
+        </w:rPr>
+        <w:t xml:space="preserve"> </w:t>
+      </w:r>
+    </w:p>
+    <w:p>
+      <w:pPr>
+        <w:spacing w:after="0" w:line="228" w:lineRule="auto"/>
+        <w:rPr>
+          <w:rFonts w:ascii="Courier New" w:eastAsia="Times New Roman" w:hAnsi="Courier New" w:cs="Courier New"/>
+          <w:sz w:val="40"/>
+          <w:szCs w:val="40"/>
+          <w:lang w:eastAsia="uk-UA"/>
+        </w:rPr>
+      </w:pPr>
+      <w:r>
+        <w:rPr>
+          <w:rFonts w:ascii="Courier New" w:eastAsia="Times New Roman" w:hAnsi="Courier New" w:cs="Courier New"/>
+          <w:szCs w:val="40"/>
+          <w:lang w:eastAsia="uk-UA"/>
+        </w:rPr>
+        <w:t>// Додаємо нову властивість після створення об'єкта</w:t>
+      </w:r>
+    </w:p>
+    <w:p>
+      <w:pPr>
+        <w:spacing w:after="0" w:line="228" w:lineRule="auto"/>
+        <w:rPr>
+          <w:rFonts w:ascii="Courier New" w:eastAsia="Times New Roman" w:hAnsi="Courier New" w:cs="Courier New"/>
+          <w:sz w:val="40"/>
+          <w:szCs w:val="40"/>
+          <w:lang w:eastAsia="uk-UA"/>
+        </w:rPr>
+      </w:pPr>
+      <w:r>
+        <w:rPr>
+          <w:rFonts w:ascii="Courier New" w:eastAsia="Times New Roman" w:hAnsi="Courier New" w:cs="Courier New"/>
+          <w:szCs w:val="40"/>
+          <w:lang w:eastAsia="uk-UA"/>
+        </w:rPr>
+        <w:t>person.city = "Кременчук";</w:t>
+      </w:r>
+    </w:p>
+    <w:p>
+      <w:pPr>
+        <w:spacing w:after="0" w:line="228" w:lineRule="auto"/>
+        <w:rPr>
+          <w:rFonts w:ascii="Courier New" w:eastAsia="Times New Roman" w:hAnsi="Courier New" w:cs="Courier New"/>
+          <w:sz w:val="40"/>
+          <w:szCs w:val="40"/>
+          <w:lang w:eastAsia="uk-UA"/>
+        </w:rPr>
+      </w:pPr>
+      <w:r>
+        <w:rPr>
+          <w:rFonts w:ascii="Courier New" w:eastAsia="Times New Roman" w:hAnsi="Courier New" w:cs="Courier New"/>
+          <w:szCs w:val="40"/>
+          <w:lang w:eastAsia="uk-UA"/>
+        </w:rPr>
+        <w:t>console.log("Місто:", person.city);</w:t>
+      </w:r>
+    </w:p>
+    <w:p>
+      <w:pPr>
+        <w:spacing w:after="0" w:line="228" w:lineRule="auto"/>
+        <w:rPr>
+          <w:rFonts w:ascii="Courier New" w:eastAsia="Times New Roman" w:hAnsi="Courier New" w:cs="Courier New"/>
+          <w:sz w:val="40"/>
+          <w:szCs w:val="40"/>
+          <w:lang w:eastAsia="uk-UA"/>
+        </w:rPr>
+      </w:pPr>
+      <w:r>
+        <w:rPr>
+          <w:rFonts w:ascii="Courier New" w:eastAsia="Times New Roman" w:hAnsi="Courier New" w:cs="Courier New"/>
+          <w:szCs w:val="40"/>
+          <w:lang w:eastAsia="uk-UA"/>
+        </w:rPr>
+        <w:t xml:space="preserve"> </w:t>
+      </w:r>
+    </w:p>
+    <w:p>
+      <w:pPr>
+        <w:spacing w:after="0" w:line="228" w:lineRule="auto"/>
+        <w:rPr>
+          <w:rFonts w:ascii="Courier New" w:eastAsia="Times New Roman" w:hAnsi="Courier New" w:cs="Courier New"/>
+          <w:sz w:val="40"/>
+          <w:szCs w:val="40"/>
+          <w:lang w:eastAsia="uk-UA"/>
+        </w:rPr>
+      </w:pPr>
+      <w:r>
+        <w:rPr>
+          <w:rFonts w:ascii="Courier New" w:eastAsia="Times New Roman" w:hAnsi="Courier New" w:cs="Courier New"/>
+          <w:szCs w:val="40"/>
+          <w:lang w:eastAsia="uk-UA"/>
+        </w:rPr>
+        <w:lastRenderedPageBreak/>
+        <w:t>// 3. Масив чисел і цикл for</w:t>
+      </w:r>
+    </w:p>
+    <w:p>
+      <w:pPr>
+        <w:spacing w:after="0" w:line="228" w:lineRule="auto"/>
+        <w:rPr>
+          <w:rFonts w:ascii="Courier New" w:eastAsia="Times New Roman" w:hAnsi="Courier New" w:cs="Courier New"/>
+          <w:sz w:val="40"/>
+          <w:szCs w:val="40"/>
+          <w:lang w:eastAsia="uk-UA"/>
+        </w:rPr>
+      </w:pPr>
+      <w:r>
+        <w:rPr>
+          <w:rFonts w:ascii="Courier New" w:eastAsia="Times New Roman" w:hAnsi="Courier New" w:cs="Courier New"/>
+          <w:szCs w:val="40"/>
+          <w:lang w:eastAsia="uk-UA"/>
+        </w:rPr>
+        <w:t>console.log("Завдання 3:");</w:t>
+      </w:r>
+    </w:p>
+    <w:p>
+      <w:pPr>
+        <w:spacing w:after="0" w:line="228" w:lineRule="auto"/>
+        <w:rPr>
+          <w:rFonts w:ascii="Courier New" w:eastAsia="Times New Roman" w:hAnsi="Courier New" w:cs="Courier New"/>
+          <w:sz w:val="40"/>
+          <w:szCs w:val="40"/>
+          <w:lang w:eastAsia="uk-UA"/>
+        </w:rPr>
+      </w:pPr>
+      <w:r>
+        <w:rPr>
+          <w:rFonts w:ascii="Courier New" w:eastAsia="Times New Roman" w:hAnsi="Courier New" w:cs="Courier New"/>
+          <w:szCs w:val="40"/>
+          <w:lang w:eastAsia="uk-UA"/>
+        </w:rPr>
+        <w:t xml:space="preserve"> </w:t>
+      </w:r>
+    </w:p>
+    <w:p>
+      <w:pPr>
+        <w:spacing w:after="0" w:line="228" w:lineRule="auto"/>
+        <w:rPr>
+          <w:rFonts w:ascii="Courier New" w:eastAsia="Times New Roman" w:hAnsi="Courier New" w:cs="Courier New"/>
+          <w:sz w:val="40"/>
+          <w:szCs w:val="40"/>
+          <w:lang w:eastAsia="uk-UA"/>
+        </w:rPr>
+      </w:pPr>
+      <w:r>
+        <w:rPr>
+          <w:rFonts w:ascii="Courier New" w:eastAsia="Times New Roman" w:hAnsi="Courier New" w:cs="Courier New"/>
+          <w:szCs w:val="40"/>
+          <w:lang w:eastAsia="uk-UA"/>
+        </w:rPr>
+        <w:t>var numbers = [3, 8, 15, 22, 7];</w:t>
+      </w:r>
+    </w:p>
+    <w:p>
+      <w:pPr>
+        <w:spacing w:after="0" w:line="228" w:lineRule="auto"/>
+        <w:rPr>
+          <w:rFonts w:ascii="Courier New" w:eastAsia="Times New Roman" w:hAnsi="Courier New" w:cs="Courier New"/>
+          <w:sz w:val="40"/>
+          <w:szCs w:val="40"/>
+          <w:lang w:eastAsia="uk-UA"/>
+        </w:rPr>
+      </w:pPr>
+      <w:r>
+        <w:rPr>
+          <w:rFonts w:ascii="Courier New" w:eastAsia="Times New Roman" w:hAnsi="Courier New" w:cs="Courier New"/>
+          <w:szCs w:val="40"/>
+          <w:lang w:eastAsia="uk-UA"/>
+        </w:rPr>
+        <w:t xml:space="preserve"> </w:t>
+      </w:r>
+    </w:p>
+    <w:p>
+      <w:pPr>
+        <w:spacing w:after="0" w:line="228" w:lineRule="auto"/>
+        <w:rPr>
+          <w:rFonts w:ascii="Courier New" w:eastAsia="Times New Roman" w:hAnsi="Courier New" w:cs="Courier New"/>
+          <w:sz w:val="40"/>
+          <w:szCs w:val="40"/>
+          <w:lang w:eastAsia="uk-UA"/>
+        </w:rPr>
+      </w:pPr>
+      <w:r>
+        <w:rPr>
+          <w:rFonts w:ascii="Courier New" w:eastAsia="Times New Roman" w:hAnsi="Courier New" w:cs="Courier New"/>
+          <w:szCs w:val="40"/>
+          <w:lang w:eastAsia="uk-UA"/>
+        </w:rPr>
+        <w:t>for (var i = 0; i &lt; numbers.length; i++) {</w:t>
+      </w:r>
+    </w:p>
+    <w:p>
+      <w:pPr>
+        <w:spacing w:after="0" w:line="228" w:lineRule="auto"/>
+        <w:rPr>
+          <w:rFonts w:ascii="Courier New" w:eastAsia="Times New Roman" w:hAnsi="Courier New" w:cs="Courier New"/>
+          <w:sz w:val="40"/>
+          <w:szCs w:val="40"/>
+          <w:lang w:eastAsia="uk-UA"/>
+        </w:rPr>
+      </w:pPr>
+      <w:r>
+        <w:rPr>
+          <w:rFonts w:ascii="Courier New" w:eastAsia="Times New Roman" w:hAnsi="Courier New" w:cs="Courier New"/>
+          <w:szCs w:val="40"/>
+          <w:lang w:eastAsia="uk-UA"/>
+        </w:rPr>
+        <w:t xml:space="preserve">    console.log(numbers[i]);</w:t>
+      </w:r>
+    </w:p>
+    <w:p>
+      <w:pPr>
+        <w:spacing w:after="0" w:line="228" w:lineRule="auto"/>
+        <w:rPr>
+          <w:rFonts w:ascii="Courier New" w:eastAsia="Times New Roman" w:hAnsi="Courier New" w:cs="Courier New"/>
+          <w:szCs w:val="40"/>
+          <w:lang w:val="en-US" w:eastAsia="uk-UA"/>
+        </w:rPr>
+      </w:pPr>
+      <w:r>
+        <w:rPr>
+          <w:rFonts w:ascii="Courier New" w:eastAsia="Times New Roman" w:hAnsi="Courier New" w:cs="Courier New"/>
+          <w:szCs w:val="40"/>
+          <w:lang w:eastAsia="uk-UA"/>
+        </w:rPr>
+        <w:t>}</w:t>
+      </w:r>
+    </w:p>
+    <w:p>
+      <w:pPr>
+        <w:spacing w:after="0" w:line="228" w:lineRule="auto"/>
+        <w:rPr>
+          <w:rFonts w:ascii="Courier New" w:eastAsia="Times New Roman" w:hAnsi="Courier New" w:cs="Courier New"/>
+          <w:sz w:val="40"/>
+          <w:szCs w:val="40"/>
+          <w:lang w:val="en-US" w:eastAsia="uk-UA"/>
+        </w:rPr>
+      </w:pPr>
+    </w:p>
+    <w:p>
+      <w:pPr>
+        <w:spacing w:after="0" w:line="360" w:lineRule="auto"/>
+        <w:ind w:firstLine="851"/>
+        <w:jc w:val="both"/>
+        <w:rPr>
+          <w:rFonts w:eastAsia="Times New Roman" w:cs="Times New Roman"/>
+          <w:szCs w:val="28"/>
+          <w:lang w:eastAsia="uk-UA"/>
+        </w:rPr>
+      </w:pPr>
       <w:r>
         <w:rPr>
           <w:rFonts w:eastAsia="Times New Roman" w:cs="Times New Roman"/>
@@ -1664,13 +1620,6 @@
           <w:lang w:eastAsia="uk-UA"/>
         </w:rPr>
         <w:t>Відповіді на контрольні питання:</w:t>
-      </w:r>
-      <w:r>
-        <w:rPr>
-          <w:rFonts w:eastAsia="Times New Roman" w:cs="Times New Roman"/>
-          <w:szCs w:val="28"/>
-          <w:lang w:eastAsia="uk-UA"/>
-        </w:rPr>
       </w:r>
     </w:p>
     <w:p>
@@ -1719,8 +1668,6 @@
           <w:lang w:eastAsia="uk-UA"/>
         </w:rPr>
       </w:pPr>
-      <w:proofErr w:type="spellStart"/>
-      <w:proofErr w:type="spellEnd"/>
       <w:r>
         <w:rPr>
           <w:rFonts w:eastAsia="Times New Roman" w:cs="Times New Roman"/>
@@ -1776,8 +1723,6 @@
           <w:lang w:eastAsia="uk-UA"/>
         </w:rPr>
       </w:pPr>
-      <w:proofErr w:type="spellStart"/>
-      <w:proofErr w:type="spellEnd"/>
       <w:r>
         <w:rPr>
           <w:rFonts w:eastAsia="Times New Roman" w:cs="Times New Roman"/>
@@ -1833,8 +1778,6 @@
           <w:lang w:eastAsia="uk-UA"/>
         </w:rPr>
       </w:pPr>
-      <w:proofErr w:type="spellStart"/>
-      <w:proofErr w:type="spellEnd"/>
       <w:r>
         <w:rPr>
           <w:rFonts w:eastAsia="Times New Roman" w:cs="Times New Roman"/>
@@ -1890,15 +1833,29 @@
           <w:lang w:eastAsia="uk-UA"/>
         </w:rPr>
       </w:pPr>
-      <w:proofErr w:type="spellStart"/>
-      <w:proofErr w:type="spellEnd"/>
-      <w:r>
-        <w:rPr>
-          <w:rFonts w:eastAsia="Times New Roman" w:cs="Times New Roman"/>
-          <w:szCs w:val="28"/>
-          <w:lang w:eastAsia="uk-UA"/>
-        </w:rPr>
-        <w:t>Нотація через крапку (user.name) використовується для простих імен властивостей, а нотація через квадратні дужки (user["name"]) — для імен із пробілами, змінних або обчислюваних ключів.</w:t>
+      <w:r>
+        <w:rPr>
+          <w:rFonts w:eastAsia="Times New Roman" w:cs="Times New Roman"/>
+          <w:szCs w:val="28"/>
+          <w:lang w:eastAsia="uk-UA"/>
+        </w:rPr>
+        <w:t xml:space="preserve">Нотація через крапку (user.name) використовується для простих імен властивостей, а нотація через квадратні дужки (user["name"]) </w:t>
+      </w:r>
+      <w:r>
+        <w:rPr>
+          <w:rFonts w:eastAsia="Times New Roman" w:cs="Times New Roman"/>
+          <w:szCs w:val="28"/>
+          <w:lang w:eastAsia="uk-UA"/>
+        </w:rPr>
+        <w:t>–</w:t>
+      </w:r>
+      <w:r>
+        <w:rPr>
+          <w:rFonts w:eastAsia="Times New Roman" w:cs="Times New Roman"/>
+          <w:szCs w:val="28"/>
+          <w:lang w:eastAsia="uk-UA"/>
+        </w:rPr>
+        <w:t xml:space="preserve"> для імен із пробілами, змінних або обчислюваних ключів.</w:t>
       </w:r>
     </w:p>
     <w:p>
@@ -1947,8 +1904,6 @@
           <w:lang w:eastAsia="uk-UA"/>
         </w:rPr>
       </w:pPr>
-      <w:proofErr w:type="spellStart"/>
-      <w:proofErr w:type="spellEnd"/>
       <w:r>
         <w:rPr>
           <w:rFonts w:eastAsia="Times New Roman" w:cs="Times New Roman"/>
@@ -2004,8 +1959,6 @@
           <w:lang w:eastAsia="uk-UA"/>
         </w:rPr>
       </w:pPr>
-      <w:proofErr w:type="spellStart"/>
-      <w:proofErr w:type="spellEnd"/>
       <w:r>
         <w:rPr>
           <w:rFonts w:eastAsia="Times New Roman" w:cs="Times New Roman"/>
@@ -2044,6 +1997,7 @@
           <w:szCs w:val="28"/>
           <w:lang w:eastAsia="uk-UA"/>
         </w:rPr>
+        <w:lastRenderedPageBreak/>
         <w:t>Як повернути значення з функції?</w:t>
       </w:r>
     </w:p>
@@ -2061,8 +2015,6 @@
           <w:lang w:eastAsia="uk-UA"/>
         </w:rPr>
       </w:pPr>
-      <w:proofErr w:type="spellStart"/>
-      <w:proofErr w:type="spellEnd"/>
       <w:r>
         <w:rPr>
           <w:rFonts w:eastAsia="Times New Roman" w:cs="Times New Roman"/>
@@ -2118,8 +2070,6 @@
           <w:lang w:eastAsia="uk-UA"/>
         </w:rPr>
       </w:pPr>
-      <w:proofErr w:type="spellStart"/>
-      <w:proofErr w:type="spellEnd"/>
       <w:r>
         <w:rPr>
           <w:rFonts w:eastAsia="Times New Roman" w:cs="Times New Roman"/>
@@ -2175,8 +2125,6 @@
           <w:lang w:eastAsia="uk-UA"/>
         </w:rPr>
       </w:pPr>
-      <w:proofErr w:type="spellStart"/>
-      <w:proofErr w:type="spellEnd"/>
       <w:r>
         <w:rPr>
           <w:rFonts w:eastAsia="Times New Roman" w:cs="Times New Roman"/>
@@ -2232,8 +2180,6 @@
           <w:lang w:eastAsia="uk-UA"/>
         </w:rPr>
       </w:pPr>
-      <w:proofErr w:type="spellStart"/>
-      <w:proofErr w:type="spellEnd"/>
       <w:r>
         <w:rPr>
           <w:rFonts w:eastAsia="Times New Roman" w:cs="Times New Roman"/>
@@ -2289,15 +2235,45 @@
           <w:lang w:eastAsia="uk-UA"/>
         </w:rPr>
       </w:pPr>
-      <w:proofErr w:type="spellStart"/>
-      <w:proofErr w:type="spellEnd"/>
-      <w:r>
-        <w:rPr>
-          <w:rFonts w:eastAsia="Times New Roman" w:cs="Times New Roman"/>
-          <w:szCs w:val="28"/>
-          <w:lang w:eastAsia="uk-UA"/>
-        </w:rPr>
-        <w:t>Елемент додають методом push() у кінець масиву, unshift() — на початок, через splice() — у довільну позицію, або присвоєнням за індексом: fruits[3] = "Pear";.</w:t>
+      <w:r>
+        <w:rPr>
+          <w:rFonts w:eastAsia="Times New Roman" w:cs="Times New Roman"/>
+          <w:szCs w:val="28"/>
+          <w:lang w:eastAsia="uk-UA"/>
+        </w:rPr>
+        <w:t xml:space="preserve">Елемент додають методом push() у кінець масиву, unshift() </w:t>
+      </w:r>
+      <w:r>
+        <w:rPr>
+          <w:rFonts w:eastAsia="Times New Roman" w:cs="Times New Roman"/>
+          <w:szCs w:val="28"/>
+          <w:lang w:eastAsia="uk-UA"/>
+        </w:rPr>
+        <w:t>–</w:t>
+      </w:r>
+      <w:r>
+        <w:rPr>
+          <w:rFonts w:eastAsia="Times New Roman" w:cs="Times New Roman"/>
+          <w:szCs w:val="28"/>
+          <w:lang w:eastAsia="uk-UA"/>
+        </w:rPr>
+        <w:t xml:space="preserve"> на початок, через splice() </w:t>
+      </w:r>
+      <w:r>
+        <w:rPr>
+          <w:rFonts w:eastAsia="Times New Roman" w:cs="Times New Roman"/>
+          <w:szCs w:val="28"/>
+          <w:lang w:eastAsia="uk-UA"/>
+        </w:rPr>
+        <w:t>–</w:t>
+      </w:r>
+      <w:r>
+        <w:rPr>
+          <w:rFonts w:eastAsia="Times New Roman" w:cs="Times New Roman"/>
+          <w:szCs w:val="28"/>
+          <w:lang w:eastAsia="uk-UA"/>
+        </w:rPr>
+        <w:t xml:space="preserve"> у довільну позицію, або присвоєнням за індексом: fruits[3] = "Pear";.</w:t>
       </w:r>
     </w:p>
     <w:p>
@@ -2346,15 +2322,29 @@
           <w:lang w:eastAsia="uk-UA"/>
         </w:rPr>
       </w:pPr>
-      <w:proofErr w:type="spellStart"/>
-      <w:proofErr w:type="spellEnd"/>
-      <w:r>
-        <w:rPr>
-          <w:rFonts w:eastAsia="Times New Roman" w:cs="Times New Roman"/>
-          <w:szCs w:val="28"/>
-          <w:lang w:eastAsia="uk-UA"/>
-        </w:rPr>
-        <w:t>У консоль масив виводять командою console.log(fruits); — буде показано весь масив. Також можна вивести елементи циклом for або об'єднати їх у рядок методом join().</w:t>
+      <w:r>
+        <w:rPr>
+          <w:rFonts w:eastAsia="Times New Roman" w:cs="Times New Roman"/>
+          <w:szCs w:val="28"/>
+          <w:lang w:eastAsia="uk-UA"/>
+        </w:rPr>
+        <w:t xml:space="preserve">У консоль масив виводять командою console.log(fruits); </w:t>
+      </w:r>
+      <w:r>
+        <w:rPr>
+          <w:rFonts w:eastAsia="Times New Roman" w:cs="Times New Roman"/>
+          <w:szCs w:val="28"/>
+          <w:lang w:eastAsia="uk-UA"/>
+        </w:rPr>
+        <w:t>–</w:t>
+      </w:r>
+      <w:r>
+        <w:rPr>
+          <w:rFonts w:eastAsia="Times New Roman" w:cs="Times New Roman"/>
+          <w:szCs w:val="28"/>
+          <w:lang w:eastAsia="uk-UA"/>
+        </w:rPr>
+        <w:t xml:space="preserve"> буде показано весь масив. Також можна вивести елементи циклом for або об'єднати їх у рядок методом join().</w:t>
       </w:r>
     </w:p>
     <w:p>
@@ -2368,8 +2358,6 @@
           <w:lang w:eastAsia="uk-UA"/>
         </w:rPr>
       </w:pPr>
-      <w:proofErr w:type="spellStart"/>
-      <w:proofErr w:type="spellEnd"/>
       <w:r>
         <w:rPr>
           <w:rFonts w:eastAsia="Times New Roman" w:cs="Times New Roman"/>

</xml_diff>